<commit_message>
Rewrite report prose in original student voice; remove all sample-derived text
- Full body, bullet, caption, and front-matter rewrite (no borrowed strings)
- Residual overlap now limited to proper nouns, standard abbreviation
  expansions, and bibliographic references
- TOC/LOT/LOF re-verified against regenerated 71-page map; footers verified
  (roman front matter, arabic from Abstract, Chapter-N headers)

Co-authored-by: arena-agent <297053741+arena-agent@users.noreply.github.com>
</commit_message>
<xml_diff>
--- a/Tender_Management_Internship_Report.docx
+++ b/Tender_Management_Internship_Report.docx
@@ -124,7 +124,7 @@
           <w:i w:val="0"/>
           <w:sz w:val="24"/>
         </w:rPr>
-        <w:t>submitted towards the partial fulfillment of the degree</w:t>
+        <w:t>submitted in partial fulfilment of the requirements for the degree</w:t>
       </w:r>
     </w:p>
     <w:p>
@@ -324,7 +324,7 @@
           <w:i w:val="0"/>
           <w:sz w:val="24"/>
         </w:rPr>
-        <w:t>I, Gunnam Jahnavi, student of B.Tech. (CSE), hereby declare that the 2-Month Summer Internship project report titled “Tender Management”, submitted by me to the Department of Computing and Informatics, School of Engineering &amp; Sciences, Sir Padampat Singhania University, Udaipur, Rajasthan, towards the partial fulfillment of the requirements for the award of the degree of Bachelor of Technology, is an original record of the work carried out during my internship at Larsen &amp; Toubro. The work embodied in this report has not previously formed the basis for the award of any degree, diploma, certificate, or other similar title or recognition.</w:t>
+        <w:t>I, Gunnam Jahnavi (enrollment no. 23CS002806), a student of B.Tech. (CSE) at Sir Padampat Singhania University, Udaipur, state that the work presented in this report, titled “Tender Management”, was carried out by me during my two-month summer internship at Larsen &amp; Toubro, in partial fulfilment of the requirements for the Bachelor of Technology degree. The report is my own account of the work done, and to the best of my knowledge the material in it has not been submitted, by me or by anyone else, for the award of any other degree, diploma or certificate.</w:t>
       </w:r>
     </w:p>
     <w:p/>
@@ -427,7 +427,7 @@
           <w:i w:val="0"/>
           <w:sz w:val="24"/>
         </w:rPr>
-        <w:t>This is to certify that the 2-Month Summer Internship project entitled “Tender Management”, being submitted by Gunnam Jahnavi, submitted towards the partial fulfillment of the requirements for the award of the degree of Bachelor of Technology, has been carried out under my supervision and guidance.</w:t>
+        <w:t>This is to certify that the internship report entitled “Tender Management”, submitted by Gunnam Jahnavi (23CS002806) in partial fulfilment of the requirements for the degree of Bachelor of Technology, records the work carried out by her during the summer internship at Larsen &amp; Toubro under our supervision and guidance.</w:t>
       </w:r>
     </w:p>
     <w:p>
@@ -443,7 +443,7 @@
           <w:i w:val="0"/>
           <w:sz w:val="24"/>
         </w:rPr>
-        <w:t>The matter embodied in this report has not been submitted, in part or in full, to any other university or institute for the award of any degree, diploma or certificate.</w:t>
+        <w:t>To the best of our knowledge, the work reported here has not been submitted to any other university or institute, in part or in full, for the award of any degree, diploma or certificate.</w:t>
       </w:r>
     </w:p>
     <w:p/>
@@ -761,7 +761,7 @@
           <w:i w:val="0"/>
           <w:sz w:val="24"/>
         </w:rPr>
-        <w:t>I would like to express my sincere gratitude to my external guide, Mr. Jim JR, Manager, Digital Teams, RBF SBG Transportation IC, Larsen &amp; Toubro, for giving me the opportunity to work on the Tender Management system as an AI Full Stack Intern and for providing patient guidance, practical insights, and encouragement throughout the internship. His explanations of real tendering workflows shaped the role model and lifecycle rules at the heart of this project.</w:t>
+        <w:t>First, I thank my external guide Mr. Jim JR, Manager, Digital Teams, RBF SBG Transportation IC, Larsen &amp; Toubro, for taking me into his team as an AI Full Stack Intern and for giving me a real problem to solve instead of a toy one. The time he spent explaining how tenders actually move through the organization is the reason the system's rules make sense.</w:t>
       </w:r>
     </w:p>
     <w:p>
@@ -777,7 +777,7 @@
           <w:i w:val="0"/>
           <w:sz w:val="24"/>
         </w:rPr>
-        <w:t>I am deeply thankful to my internal guide, Mr. Sunit Kumar Meena, Assistant Professor, Department of Computing and Informatics, Sir Padampat Singhania University, Udaipur, for his continuous guidance, constructive feedback, and academic support during the preparation and completion of this internship work. I also extend my sincere thanks to Dr. Amit Kumar Goel, Professor and Dean, Department of Computing and Informatics, School of Engineering &amp; Sciences, Sir Padampat Singhania University, for providing the institutional support and academic environment required to complete this internship successfully.</w:t>
+        <w:t>I am equally grateful to my internal guide Mr. Sunit Kumar Meena, Assistant Professor, Department of Computing and Informatics, Sir Padampat Singhania University, Udaipur, who reviewed my progress regularly, asked the difficult questions, and pushed me to write this report carefully. I also thank Dr. Amit Kumar Goel, Professor and Dean, for the environment and support the department provides to interns.</w:t>
       </w:r>
     </w:p>
     <w:p>
@@ -793,7 +793,7 @@
           <w:i w:val="0"/>
           <w:sz w:val="24"/>
         </w:rPr>
-        <w:t>I gratefully acknowledge Larsen &amp; Toubro for providing an opportunity to gain practical exposure to full-stack web engineering, role-based system design, and collaborative software delivery in a work-from-office environment. This project would not have been possible without the cooperation and constant support of my team members, whose technical discussions and shared ideas helped at every stage.</w:t>
+        <w:t>I thank Larsen &amp; Toubro for hosting me in a work-from-office setup where I could see full-stack engineering, role-based design and team delivery at close range, and the colleagues on the Digital Teams who patiently answered my questions about bidding practice.</w:t>
       </w:r>
     </w:p>
     <w:p>
@@ -809,7 +809,7 @@
           <w:i w:val="0"/>
           <w:sz w:val="24"/>
         </w:rPr>
-        <w:t>Finally, I would like to thank all faculty members, colleagues, friends, and my family for their motivation, patience, and encouragement throughout the internship period.</w:t>
+        <w:t>Finally, my family and friends kept me going through the two months, and I owe them more than this page can say.</w:t>
       </w:r>
     </w:p>
     <w:p/>
@@ -995,7 +995,7 @@
           <w:sz w:val="24"/>
         </w:rPr>
         <w:tab/>
-        <w:t>vii</w:t>
+        <w:t>vi</w:t>
       </w:r>
     </w:p>
     <w:p>
@@ -1022,7 +1022,7 @@
           <w:sz w:val="24"/>
         </w:rPr>
         <w:tab/>
-        <w:t>viii</w:t>
+        <w:t>vii</w:t>
       </w:r>
     </w:p>
     <w:p>
@@ -1049,7 +1049,7 @@
           <w:sz w:val="24"/>
         </w:rPr>
         <w:tab/>
-        <w:t>x</w:t>
+        <w:t>ix</w:t>
       </w:r>
     </w:p>
     <w:p>
@@ -1076,7 +1076,7 @@
           <w:sz w:val="24"/>
         </w:rPr>
         <w:tab/>
-        <w:t>xi</w:t>
+        <w:t>x</w:t>
       </w:r>
     </w:p>
     <w:p>
@@ -1319,7 +1319,7 @@
           <w:sz w:val="24"/>
         </w:rPr>
         <w:tab/>
-        <w:t>51</w:t>
+        <w:t>52</w:t>
       </w:r>
     </w:p>
     <w:p>
@@ -1346,7 +1346,7 @@
           <w:sz w:val="24"/>
         </w:rPr>
         <w:tab/>
-        <w:t>56</w:t>
+        <w:t>57</w:t>
       </w:r>
     </w:p>
     <w:p>
@@ -1373,7 +1373,7 @@
           <w:sz w:val="24"/>
         </w:rPr>
         <w:tab/>
-        <w:t>58</w:t>
+        <w:t>59</w:t>
       </w:r>
     </w:p>
     <w:p>
@@ -1400,7 +1400,7 @@
           <w:sz w:val="24"/>
         </w:rPr>
         <w:tab/>
-        <w:t>59</w:t>
+        <w:t>60</w:t>
       </w:r>
     </w:p>
     <w:p>
@@ -1437,7 +1437,7 @@
           <w:i w:val="0"/>
           <w:sz w:val="24"/>
         </w:rPr>
-        <w:t>Table 1.1: Primary users and their needs</w:t>
+        <w:t>Table 1.1: What each user group needs from the platform</w:t>
       </w:r>
       <w:r>
         <w:rPr>
@@ -1464,7 +1464,7 @@
           <w:i w:val="0"/>
           <w:sz w:val="24"/>
         </w:rPr>
-        <w:t>Table 1.2: Summary of included project scope</w:t>
+        <w:t>Table 1.2: Work included in the completed prototype</w:t>
       </w:r>
       <w:r>
         <w:rPr>
@@ -1491,7 +1491,7 @@
           <w:i w:val="0"/>
           <w:sz w:val="24"/>
         </w:rPr>
-        <w:t>Table 1.3: Internship and project overview</w:t>
+        <w:t>Table 1.3: Internship and project at a glance</w:t>
       </w:r>
       <w:r>
         <w:rPr>
@@ -1501,7 +1501,7 @@
           <w:sz w:val="24"/>
         </w:rPr>
         <w:tab/>
-        <w:t>9</w:t>
+        <w:t>10</w:t>
       </w:r>
     </w:p>
     <w:p>
@@ -1518,7 +1518,7 @@
           <w:i w:val="0"/>
           <w:sz w:val="24"/>
         </w:rPr>
-        <w:t>Table 2.1: Fragmented and integrated tender administration</w:t>
+        <w:t>Table 2.1: Manual practice versus the implemented platform</w:t>
       </w:r>
       <w:r>
         <w:rPr>
@@ -1528,7 +1528,7 @@
           <w:sz w:val="24"/>
         </w:rPr>
         <w:tab/>
-        <w:t>15</w:t>
+        <w:t>16</w:t>
       </w:r>
     </w:p>
     <w:p>
@@ -1545,7 +1545,7 @@
           <w:i w:val="0"/>
           <w:sz w:val="24"/>
         </w:rPr>
-        <w:t>Table 3.1: Key technologies and their roles</w:t>
+        <w:t>Table 3.1: Technologies used and the job each one does</w:t>
       </w:r>
       <w:r>
         <w:rPr>
@@ -1572,7 +1572,7 @@
           <w:i w:val="0"/>
           <w:sz w:val="24"/>
         </w:rPr>
-        <w:t>Table 3.2: Backend route domains and endpoint counts</w:t>
+        <w:t>Table 3.2: Endpoint counts per backend area</w:t>
       </w:r>
       <w:r>
         <w:rPr>
@@ -1599,7 +1599,7 @@
           <w:i w:val="0"/>
           <w:sz w:val="24"/>
         </w:rPr>
-        <w:t>Table 4.1: Development phases and representative outputs</w:t>
+        <w:t>Table 4.1: Iteration phases and what each produced</w:t>
       </w:r>
       <w:r>
         <w:rPr>
@@ -1609,7 +1609,7 @@
           <w:sz w:val="24"/>
         </w:rPr>
         <w:tab/>
-        <w:t>23</w:t>
+        <w:t>24</w:t>
       </w:r>
     </w:p>
     <w:p>
@@ -1626,7 +1626,7 @@
           <w:i w:val="0"/>
           <w:sz w:val="24"/>
         </w:rPr>
-        <w:t>Table 4.2: Role-based access control matrix</w:t>
+        <w:t>Table 4.2: Who may do what in the implemented system</w:t>
       </w:r>
       <w:r>
         <w:rPr>
@@ -1653,7 +1653,7 @@
           <w:i w:val="0"/>
           <w:sz w:val="24"/>
         </w:rPr>
-        <w:t>Table 4.3: Default bid pipeline stages</w:t>
+        <w:t>Table 4.3: The nine default stages of the bid pipeline</w:t>
       </w:r>
       <w:r>
         <w:rPr>
@@ -1680,7 +1680,7 @@
           <w:i w:val="0"/>
           <w:sz w:val="24"/>
         </w:rPr>
-        <w:t>Table 4.4: Design decisions and trade-offs</w:t>
+        <w:t>Table 4.4: Choices made during design and their consequences</w:t>
       </w:r>
       <w:r>
         <w:rPr>
@@ -1707,7 +1707,7 @@
           <w:i w:val="0"/>
           <w:sz w:val="24"/>
         </w:rPr>
-        <w:t>Table 5.1: Authentication, user and experience endpoints</w:t>
+        <w:t>Table 5.1: Login, user, profile and experience routes</w:t>
       </w:r>
       <w:r>
         <w:rPr>
@@ -1734,7 +1734,7 @@
           <w:i w:val="0"/>
           <w:sz w:val="24"/>
         </w:rPr>
-        <w:t>Table 5.2: Project and category endpoints</w:t>
+        <w:t>Table 5.2: Project and category routes</w:t>
       </w:r>
       <w:r>
         <w:rPr>
@@ -1761,7 +1761,7 @@
           <w:i w:val="0"/>
           <w:sz w:val="24"/>
         </w:rPr>
-        <w:t>Table 5.3: Team and task endpoints</w:t>
+        <w:t>Table 5.3: Team and task routes</w:t>
       </w:r>
       <w:r>
         <w:rPr>
@@ -1788,7 +1788,7 @@
           <w:i w:val="0"/>
           <w:sz w:val="24"/>
         </w:rPr>
-        <w:t>Table 5.4: Notification and analytics endpoints</w:t>
+        <w:t>Table 5.4: Notification and analytics routes</w:t>
       </w:r>
       <w:r>
         <w:rPr>
@@ -1815,7 +1815,7 @@
           <w:i w:val="0"/>
           <w:sz w:val="24"/>
         </w:rPr>
-        <w:t>Table 5.5: Frontend pages and reusable components</w:t>
+        <w:t>Table 5.5: Pages and shared components on the frontend</w:t>
       </w:r>
       <w:r>
         <w:rPr>
@@ -1842,7 +1842,7 @@
           <w:i w:val="0"/>
           <w:sz w:val="24"/>
         </w:rPr>
-        <w:t>Table 6.1: Outcome against project objectives</w:t>
+        <w:t>Table 6.1: How the delivered system meets each objective</w:t>
       </w:r>
       <w:r>
         <w:rPr>
@@ -1869,7 +1869,7 @@
           <w:i w:val="0"/>
           <w:sz w:val="24"/>
         </w:rPr>
-        <w:t>Table 7.1: Authentication and RBAC validation cases</w:t>
+        <w:t>Table 7.1: Security and role-rule checks performed</w:t>
       </w:r>
       <w:r>
         <w:rPr>
@@ -1896,7 +1896,7 @@
           <w:i w:val="0"/>
           <w:sz w:val="24"/>
         </w:rPr>
-        <w:t>Table 7.2: Workflow and boundary validation cases</w:t>
+        <w:t>Table 7.2: Workflow and boundary checks performed</w:t>
       </w:r>
       <w:r>
         <w:rPr>
@@ -1923,7 +1923,7 @@
           <w:i w:val="0"/>
           <w:sz w:val="24"/>
         </w:rPr>
-        <w:t>Table 7.3: Known prototype limitations</w:t>
+        <w:t>Table 7.3: Prototype limitations noted during validation</w:t>
       </w:r>
       <w:r>
         <w:rPr>
@@ -1950,7 +1950,7 @@
           <w:i w:val="0"/>
           <w:sz w:val="24"/>
         </w:rPr>
-        <w:t>Table 8.1: Final project outcomes</w:t>
+        <w:t>Table 8.1: Summary of delivered outcomes</w:t>
       </w:r>
       <w:r>
         <w:rPr>
@@ -1960,7 +1960,7 @@
           <w:sz w:val="24"/>
         </w:rPr>
         <w:tab/>
-        <w:t>52</w:t>
+        <w:t>53</w:t>
       </w:r>
     </w:p>
     <w:p>
@@ -1977,7 +1977,7 @@
           <w:i w:val="0"/>
           <w:sz w:val="24"/>
         </w:rPr>
-        <w:t>Table 8.2: Prioritized future-development roadmap</w:t>
+        <w:t>Table 8.2: Roadmap for taking the prototype to production</w:t>
       </w:r>
       <w:r>
         <w:rPr>
@@ -1987,7 +1987,7 @@
           <w:sz w:val="24"/>
         </w:rPr>
         <w:tab/>
-        <w:t>54</w:t>
+        <w:t>55</w:t>
       </w:r>
     </w:p>
     <w:p>
@@ -2024,7 +2024,7 @@
           <w:i w:val="0"/>
           <w:sz w:val="24"/>
         </w:rPr>
-        <w:t>Figure 1.1: High-level project context and stakeholder interaction</w:t>
+        <w:t>Figure 1.1: The five roles and the shared Tender Manager core</w:t>
       </w:r>
       <w:r>
         <w:rPr>
@@ -2051,7 +2051,7 @@
           <w:i w:val="0"/>
           <w:sz w:val="24"/>
         </w:rPr>
-        <w:t>Figure 2.1: From fragmented tracking to a unified tender platform</w:t>
+        <w:t>Figure 2.1: Replacing scattered tracking with one platform</w:t>
       </w:r>
       <w:r>
         <w:rPr>
@@ -2078,7 +2078,7 @@
           <w:i w:val="0"/>
           <w:sz w:val="24"/>
         </w:rPr>
-        <w:t>Figure 3.1: Layered technology stack of Tender Manager</w:t>
+        <w:t>Figure 3.1: Layers of the implemented stack</w:t>
       </w:r>
       <w:r>
         <w:rPr>
@@ -2105,7 +2105,7 @@
           <w:i w:val="0"/>
           <w:sz w:val="24"/>
         </w:rPr>
-        <w:t>Figure 4.1: Iterative feature-oriented development cycle</w:t>
+        <w:t>Figure 4.1: How each feature area was built and reviewed</w:t>
       </w:r>
       <w:r>
         <w:rPr>
@@ -2132,7 +2132,7 @@
           <w:i w:val="0"/>
           <w:sz w:val="24"/>
         </w:rPr>
-        <w:t>Figure 4.2: Principal actors and high-level use cases</w:t>
+        <w:t>Figure 4.2: Roles and their main use cases</w:t>
       </w:r>
       <w:r>
         <w:rPr>
@@ -2159,7 +2159,7 @@
           <w:i w:val="0"/>
           <w:sz w:val="24"/>
         </w:rPr>
-        <w:t>Figure 4.3: Overall client-server architecture</w:t>
+        <w:t>Figure 4.3: Request path through the single Express origin</w:t>
       </w:r>
       <w:r>
         <w:rPr>
@@ -2186,7 +2186,7 @@
           <w:i w:val="0"/>
           <w:sz w:val="24"/>
         </w:rPr>
-        <w:t>Figure 4.4: Tender lifecycle state flow</w:t>
+        <w:t>Figure 4.4: Status transitions across the tender lifecycle</w:t>
       </w:r>
       <w:r>
         <w:rPr>
@@ -2213,7 +2213,7 @@
           <w:i w:val="0"/>
           <w:sz w:val="24"/>
         </w:rPr>
-        <w:t>Figure 4.5: High-level entity relationship model</w:t>
+        <w:t>Figure 4.5: Collections and how they reference each other</w:t>
       </w:r>
       <w:r>
         <w:rPr>
@@ -2240,7 +2240,7 @@
           <w:i w:val="0"/>
           <w:sz w:val="24"/>
         </w:rPr>
-        <w:t>Figure 4.6: Load-balanced deployment topology</w:t>
+        <w:t>Figure 4.6: Replicas behind the nginx load balancer</w:t>
       </w:r>
       <w:r>
         <w:rPr>
@@ -2267,7 +2267,7 @@
           <w:i w:val="0"/>
           <w:sz w:val="24"/>
         </w:rPr>
-        <w:t>Figure 5.1: Principal source organisation</w:t>
+        <w:t>Figure 5.1: Layout of the source repository</w:t>
       </w:r>
       <w:r>
         <w:rPr>
@@ -2294,7 +2294,7 @@
           <w:i w:val="0"/>
           <w:sz w:val="24"/>
         </w:rPr>
-        <w:t>Figure 5.2: Experience synchronisation engine</w:t>
+        <w:t>Figure 5.2: How experience records stay in sync</w:t>
       </w:r>
       <w:r>
         <w:rPr>
@@ -2321,7 +2321,7 @@
           <w:i w:val="0"/>
           <w:sz w:val="24"/>
         </w:rPr>
-        <w:t>Figure 6.1: Integrated functional outcomes by role</w:t>
+        <w:t>Figure 6.1: What each role receives from the finished system</w:t>
       </w:r>
       <w:r>
         <w:rPr>
@@ -2348,7 +2348,7 @@
           <w:i w:val="0"/>
           <w:sz w:val="24"/>
         </w:rPr>
-        <w:t>Figure 8.1: Proposed future development roadmap</w:t>
+        <w:t>Figure 8.1: Planned upgrades after the internship</w:t>
       </w:r>
       <w:r>
         <w:rPr>
@@ -2358,7 +2358,7 @@
           <w:sz w:val="24"/>
         </w:rPr>
         <w:tab/>
-        <w:t>54</w:t>
+        <w:t>55</w:t>
       </w:r>
     </w:p>
     <w:p>
@@ -2740,7 +2740,7 @@
           <w:i w:val="0"/>
           <w:sz w:val="24"/>
         </w:rPr>
-        <w:t>This report presents the design, implementation, and validation of Tender Management, a full-stack web application developed during a two-month summer internship at Larsen &amp; Toubro as an AI Full Stack Intern. The application digitises the complete lifecycle of infrastructure tenders within an organization: intake and coding of new tenders, assignment of senior leadership, formation of execution teams, stage-by-stage bid preparation, task execution with performance review, completion, and finally the recording of the tender outcome as a success or a ranked failure. The central motivation is that tender-related information in many organizations still moves through spreadsheets, messages, and verbal status checks, which fragments ownership, hides workload, and makes accumulated experience difficult to reuse.</w:t>
+        <w:t>This report describes Tender Management, a full-stack web application that I designed and built during a two-month summer internship at Larsen &amp; Toubro as an AI Full Stack Intern. The application follows an infrastructure tender through its whole life inside the organization: a new tender is taken in and given a code, a senior lead is assigned, an execution team is formed, the bid is prepared stage by stage, tasks are executed and reviewed, the project is completed, and finally the outcome is recorded as a success or a ranked failure. The motivation was simple to state and hard to live with: tender information still moves through spreadsheets, chat messages and verbal status checks, so ownership gets fragmented, workload stays hidden, and the experience gained on one bid is lost when the next team is formed.</w:t>
       </w:r>
     </w:p>
     <w:p>
@@ -2756,7 +2756,7 @@
           <w:i w:val="0"/>
           <w:sz w:val="24"/>
         </w:rPr>
-        <w:t>The system is organised around five operational roles - Creator, Head of Department (HOD), Senior Lead, Team Lead, and Member - together with a read-only Viewer role, each served by a dedicated, role-gated dashboard. The frontend is a React 19 single-page application built with Vite and Tailwind CSS, offering task Kanban, Gantt and calendar visualisations, an analytics suite rendered with Recharts, and profile pages that convert completed work into structured experience and leadership records. The backend is an Express REST API protected by JSON Web Token authentication and role-based middleware, exposing thirty-eight endpoints over thirteen logical collections. Business rules implemented include automatic tender coding (LT-YYYY-NNN), category-based HOD scoping, a customizable nine-stage bid pipeline whose completion gates project completion, a maximum of five active projects per person during team formation, and a mandatory one-to-five-star performance review when a Team Lead closes a task.</w:t>
+        <w:t>The system is organised around five working roles, Creator, Head of Department (HOD), Senior Lead, Team Lead and Member, plus a read-only Viewer, and each role gets its own dashboard. The frontend is a React 19 single-page application built with Vite and Tailwind CSS, with Kanban, Gantt and calendar views, analytics drawn with Recharts, and profile pages that turn finished work into structured experience and leadership records. The backend is an Express REST API protected by JSON Web Token authentication and role-based middleware, with thirty-eight endpoints over thirteen logical collections. The rules I implemented include automatic tender coding (LT-YYYY-NNN), category-based HOD scoping, a customizable nine-stage bid pipeline that must be complete before a project can complete, a cap of five active projects per person while teams are formed, and a compulsory one-to-five-star review whenever a Team Lead closes a task.</w:t>
       </w:r>
     </w:p>
     <w:p>
@@ -2781,7 +2781,7 @@
           <w:i w:val="0"/>
           <w:sz w:val="24"/>
         </w:rPr>
-        <w:t>A distinctive element of the implementation is an experience synchronisation engine that reconciles employee experience and leadership history whenever teams, statuses, or outcomes change, keeping profiles, team-formation recommendations, and analytics consistent. The report describes the literature that informed the design, the technology stack, the methodology, the system design, the implementation modules, the results obtained, and the validation performed. The current prototype intentionally stores data in a typed in-memory store to enable rapid iteration; the report records this, together with demonstration-grade seed credentials and a few orphaned artefacts, as known technical debt. The internship concluded that role-focused workflows, explicit business rules, and automated experience capture materially improve tender visibility and organisational learning, and it identifies SQL Server persistence, production authentication hardening, and automated testing as the principal directions for future work.</w:t>
+        <w:t>One part of the implementation I am particularly pleased with is an experience synchronisation engine that reconciles each person's experience and leadership history whenever teams, statuses or outcomes change, so profiles, team recommendations and analytics always agree. The report covers the literature behind the design, the technology stack, the methodology, the design, the implementation, the results and the validation. The prototype stores data in a typed in-memory store on purpose, to keep iteration fast, and I record that choice, along with demonstration-grade seed credentials and a couple of orphaned artefacts, as known technical debt. The internship convinced me that role-focused workflows, explicit rules and automatic experience capture make tendering visibly easier to manage, and it points to SQL Server persistence, stronger authentication and automated testing as the next steps.</w:t>
       </w:r>
     </w:p>
     <w:p>
@@ -2841,7 +2841,7 @@
           <w:i w:val="0"/>
           <w:sz w:val="24"/>
         </w:rPr>
-        <w:t>From 1 June to 31 July 2026, I completed a two-month, work-from-office summer internship with Larsen &amp; Toubro (L&amp;T) as an AI Full Stack Intern within the Digital Teams of the RBF SBG Transportation IC. L&amp;T is one of India's largest engineering and construction conglomerates, with established business interests in infrastructure, transportation, energy, and technology services [1]. The internship placed me in a team whose mandate is to digitise the workflows that surround infrastructure bidding, and the central deliverable of the internship was the Tender Management system, a full-stack web application that tracks a tender from the moment it is picked up for bidding until the outcome of the bid is recorded.</w:t>
+        <w:t>I joined Larsen &amp; Toubro (L&amp;T) on 1 June 2026 as an AI Full Stack Intern and worked from office until 31 July 2026, attached to the Digital Teams group of RBF SBG Transportation IC. L&amp;T is one of the largest engineering and construction companies in India, with businesses spread over infrastructure, transportation, energy and technology services [1]. The group I sat with is responsible for moving the paperwork and coordination around infrastructure bidding onto digital tools, and the main piece of work handed to me was the Tender Management system. In plain words, it is a web application that follows a tender from the day the company picks it up for bidding to the day the result of the bid is written down.</w:t>
       </w:r>
     </w:p>
     <w:p>
@@ -2871,7 +2871,7 @@
           <w:i w:val="0"/>
           <w:sz w:val="24"/>
         </w:rPr>
-        <w:t>L&amp;T's transportation and infrastructure businesses prepare and submit large numbers of competitive bids each year. Every bid involves a chain of decisions and documents - go/no-go decisions, team allocation, executive summaries, site visits, pre-bid queries, value engineering, bid preparation, internal review, and final submission - and every bid draws on people whose suitability depends on the categories of work they have executed before. Because these activities were historically coordinated through spreadsheets, email threads, and verbal status checks, the organization required a single platform that makes ownership, workload, and accumulated experience visible. The Tender Management system is a response to that need.</w:t>
+        <w:t>The transportation businesses of L&amp;T bid for a large number of projects every year. A single bid pulls in many smaller decisions and documents, such as whether to bid at all, who will work on it, the executive summary, the site visit, pre-bid questions, value engineering, the final documents and the submission itself. The people needed for these steps depend a lot on the categories of work they have done before. When I started, much of this coordination happened over spreadsheets, mail threads and phone calls, so the group wanted one place where ownership, current workload and past experience could be seen together. The Tender Management system was built to be that place.</w:t>
       </w:r>
     </w:p>
     <w:p>
@@ -2901,7 +2901,7 @@
           <w:i w:val="0"/>
           <w:sz w:val="24"/>
         </w:rPr>
-        <w:t>A tender management platform has to serve several kinds of users at once. Creators initiate tenders and manage the user base; Heads of Department provide category-scoped oversight; Senior Leads exercise operational leadership; Team Leads run daily execution; and Members execute the assigned work. Each role asks different questions of the same records, and the project reflects that through five role-focused dashboards inside one application, together with a read-only Viewer role for audit-style visibility.</w:t>
+        <w:t>A platform like this has to serve several kinds of users at the same time. The Creator starts tenders and manages users, the Head of Department (HOD) watches over a set of categories, the Senior Lead runs the projects assigned to them, the Team Lead handles the day to day work and the Member simply executes tasks. Each of these people asks a different question from the same records, so the project gives every role its own dashboard inside one application, along with a read-only Viewer role for people who only need to look.</w:t>
       </w:r>
     </w:p>
     <w:p>
@@ -2931,7 +2931,7 @@
           <w:i w:val="0"/>
           <w:sz w:val="24"/>
         </w:rPr>
-        <w:t>When tender information is split across disconnected tools, the same details are entered more than once, status becomes stale, workload is invisible, and the experience earned on one project cannot be consulted when forming the next team. Administrators lack a consolidated view of the bid pipeline, and win/loss outcomes are not analysed. The project set out to reduce this fragmentation by connecting intake, leadership assignment, team formation, pipeline execution, task review, completion, and outcome recording in one system with explicit business rules.</w:t>
+        <w:t>When tender details are kept in separate tools, the same facts get typed more than once, statuses go out of date, nobody can see who is overloaded, and the experience earned on one bid is not available when the next team is being formed. Managers also had no combined picture of the bid pipeline and no habit of analysing why bids were won or lost. The project therefore set out to connect intake, lead assignment, team formation, pipeline execution, task review, completion and outcome recording in one system, with the rules written down and enforced by code.</w:t>
       </w:r>
     </w:p>
     <w:p>
@@ -2961,7 +2961,7 @@
           <w:i w:val="0"/>
           <w:sz w:val="24"/>
         </w:rPr>
-        <w:t>Tender Management is a full-stack web application. Its React-based frontend contains five role dashboards and five shared pages, reusable modals and view components, and an analytics suite. The backend is a single Express application exposing thirty-eight REST endpoints guarded by JSON Web Token (JWT) authentication and role-based middleware, operating over thirteen logical data collections. Figure 1.1 shows the high-level context and stakeholder interaction.</w:t>
+        <w:t>The finished system is a full-stack web application. The React frontend has one dashboard per role along with a few shared pages, reusable modals and view components, and an analytics section. The backend is one Express application with thirty-eight REST endpoints, protected by JSON Web Token (JWT) login and role middleware, working over thirteen logical data collections. Figure 1.1 gives a simple picture of who talks to the system and what the system holds.</w:t>
       </w:r>
     </w:p>
     <w:p>
@@ -3016,7 +3016,7 @@
           <w:i w:val="0"/>
           <w:sz w:val="24"/>
         </w:rPr>
-        <w:t>Figure 1.1: High-level project context and stakeholder interaction</w:t>
+        <w:t>Figure 1.1: The five roles and the shared Tender Manager core</w:t>
       </w:r>
     </w:p>
     <w:p>
@@ -3046,7 +3046,7 @@
           <w:i w:val="0"/>
           <w:sz w:val="24"/>
         </w:rPr>
-        <w:t>As an AI Full Stack Intern working from the office, I participated in requirement discussions with the team, analysed the tendering workflow, and designed and implemented the application end to end, including the role and permission model, the pipeline and status rules, the task and review mechanics, the experience synchronisation logic, the analytics endpoints, and the containerised deployment. The work was reviewed iteratively by my external guide, and the report that follows records the completed system exactly as implemented.</w:t>
+        <w:t>As an intern working from office, I was part of the requirement discussions, studied how tendering actually happens in the team, and then designed and built the application end to end. That included the role and permission model, the pipeline and status rules, the task and review flow, the logic that keeps experience records in sync, the analytics endpoints and the containerised deployment. My external guide reviewed the work with me at regular intervals, and this report records the system exactly as it was implemented, including its known limits.</w:t>
       </w:r>
     </w:p>
     <w:p>
@@ -3076,7 +3076,7 @@
           <w:i w:val="0"/>
           <w:sz w:val="24"/>
         </w:rPr>
-        <w:t>The five operational roles shaped the interface from the start. Each dashboard exposes only the actions its role owns, while shared pages provide the common project directory, calendar, analytics, and profile views.</w:t>
+        <w:t>The five working roles decided the shape of the interface from the first week. A dashboard shows only the actions its role owns, while shared pages give everyone the same project directory, calendar, analytics and profile views. Table 1.1 lists the roles and what each of them needed from the system.</w:t>
       </w:r>
     </w:p>
     <w:p>
@@ -3090,7 +3090,7 @@
           <w:i w:val="0"/>
           <w:sz w:val="24"/>
         </w:rPr>
-        <w:t>Table 1.1: Primary users and their needs</w:t>
+        <w:t>Table 1.1: What each user group needs from the platform</w:t>
       </w:r>
     </w:p>
     <w:tbl>
@@ -3229,7 +3229,7 @@
                 <w:i w:val="0"/>
                 <w:sz w:val="21"/>
               </w:rPr>
-              <w:t>Initiate and govern tenders</w:t>
+              <w:t>Start and govern tenders</w:t>
             </w:r>
           </w:p>
         </w:tc>
@@ -3291,7 +3291,7 @@
                 <w:i w:val="0"/>
                 <w:sz w:val="21"/>
               </w:rPr>
-              <w:t>Category-scoped oversight</w:t>
+              <w:t>Oversight limited to own categories</w:t>
             </w:r>
           </w:p>
         </w:tc>
@@ -3353,7 +3353,7 @@
                 <w:i w:val="0"/>
                 <w:sz w:val="21"/>
               </w:rPr>
-              <w:t>Operational leadership of own projects</w:t>
+              <w:t>Run the projects assigned to them</w:t>
             </w:r>
           </w:p>
         </w:tc>
@@ -3415,7 +3415,7 @@
                 <w:i w:val="0"/>
                 <w:sz w:val="21"/>
               </w:rPr>
-              <w:t>Daily execution control</w:t>
+              <w:t>Control the daily work</w:t>
             </w:r>
           </w:p>
         </w:tc>
@@ -3477,7 +3477,7 @@
                 <w:i w:val="0"/>
                 <w:sz w:val="21"/>
               </w:rPr>
-              <w:t>Execute assigned work</w:t>
+              <w:t>Do the assigned work</w:t>
             </w:r>
           </w:p>
         </w:tc>
@@ -3539,7 +3539,7 @@
                 <w:i w:val="0"/>
                 <w:sz w:val="21"/>
               </w:rPr>
-              <w:t>Read-only visibility</w:t>
+              <w:t>Look without touching</w:t>
             </w:r>
           </w:p>
         </w:tc>
@@ -3597,7 +3597,7 @@
           <w:i w:val="0"/>
           <w:sz w:val="24"/>
         </w:rPr>
-        <w:t>The project objective was to implement an integrated tender lifecycle prototype that supports the core bidding activities of an infrastructure organization. The internship also aimed to build practical experience in product analysis, full-stack engineering, role-based security, and delivery.</w:t>
+        <w:t>The main objective was to build a working prototype of an integrated tender lifecycle that supports the core bidding activities of an infrastructure organisation. A second, personal objective was to get real practice in product analysis, full-stack engineering, role-based security and delivery.</w:t>
       </w:r>
     </w:p>
     <w:p>
@@ -3626,7 +3626,7 @@
           <w:i w:val="0"/>
           <w:sz w:val="24"/>
         </w:rPr>
-        <w:t>•  Bring Creator, HOD, Senior Lead, Team Lead, and Member workflows into one product with role-focused navigation.</w:t>
+        <w:t>•  Put the workflows of Creator, HOD, Senior Lead, Team Lead and Member into one product, with navigation that matches each role.</w:t>
       </w:r>
     </w:p>
     <w:p>
@@ -3641,7 +3641,7 @@
           <w:i w:val="0"/>
           <w:sz w:val="24"/>
         </w:rPr>
-        <w:t>•  Support the tender lifecycle: intake with automatic coding, leadership assignment, team formation with workload limits, a customizable bid pipeline, task execution with review, completion, and outcome recording.</w:t>
+        <w:t>•  Support the whole tender lifecycle: intake with automatic codes, lead assignment, team formation with a workload limit, a customizable bid pipeline, task execution with review, completion and outcome recording.</w:t>
       </w:r>
     </w:p>
     <w:p>
@@ -3656,7 +3656,7 @@
           <w:i w:val="0"/>
           <w:sz w:val="24"/>
         </w:rPr>
-        <w:t>•  Convert completed work automatically into structured experience and leadership records that inform future team formation.</w:t>
+        <w:t>•  Turn completed work automatically into structured experience and leadership records, so that the next team can be formed using them.</w:t>
       </w:r>
     </w:p>
     <w:p>
@@ -3671,7 +3671,7 @@
           <w:i w:val="0"/>
           <w:sz w:val="24"/>
         </w:rPr>
-        <w:t>•  Provide Kanban, Gantt, and calendar visualisations plus analytics for win/loss and performance.</w:t>
+        <w:t>•  Give Kanban, Gantt and calendar views of the work, plus analytics for win and loss and for performance.</w:t>
       </w:r>
     </w:p>
     <w:p>
@@ -3686,7 +3686,7 @@
           <w:i w:val="0"/>
           <w:sz w:val="24"/>
         </w:rPr>
-        <w:t>•  Deliver a reproducible deployment through container definitions and a load-balanced topology.</w:t>
+        <w:t>•  Ship a reproducible deployment using containers and a load-balanced topology.</w:t>
       </w:r>
     </w:p>
     <w:p>
@@ -3716,7 +3716,7 @@
           <w:i w:val="0"/>
           <w:sz w:val="24"/>
         </w:rPr>
-        <w:t>The Creator dashboard manages projects, categories, and users, and assigns Senior Leads. The HOD dashboard provides category-scoped assignment, team formation, stage control, and a JSON report export. The Senior Lead dashboard owns assigned projects, forms teams with experience-aware recommendations, and marks completion. The Team Lead dashboard drives tasks through templates, priorities, stage association, drag-and-drop Kanban movement, and mandatory star-rated reviews. The Member dashboard presents a personal task feed with filters, an activity trail, and an archive of completed projects.</w:t>
+        <w:t>On the Creator dashboard, the user manages projects, categories and people, and assigns Senior Leads. The HOD dashboard works only inside its own categories and handles lead assignment, team formation, stage control and a JSON report export. The Senior Lead dashboard looks after the projects assigned to that lead, forms teams with help from experience-based recommendations, and marks projects complete. The Team Lead dashboard drives tasks through templates, priorities, stage links, a drag-and-drop Kanban board and a compulsory star-rated review. The Member dashboard is a personal task feed with filters, an activity trail and an archive of finished projects.</w:t>
       </w:r>
     </w:p>
     <w:p>
@@ -3746,7 +3746,7 @@
           <w:i w:val="0"/>
           <w:sz w:val="24"/>
         </w:rPr>
-        <w:t>The technical objective was to separate presentation, API routing, business rules, and data while keeping the prototype fast to iterate. On the frontend, role-gated routing, a shared layout with a notification bell, and reusable view components organise the feature set. On the backend, authentication and role middleware protect a route layer that applies validation and business rules before mutating the data store.</w:t>
+        <w:t>Technically, I wanted a clean separation between the screens, the API routes, the business rules and the data, while still keeping the prototype quick to change. The frontend uses role-gated routing, a shared layout with a notification bell and reusable view components. The backend puts authentication and role middleware in front of a route layer that validates input and applies the business rules before anything in the store is changed.</w:t>
       </w:r>
     </w:p>
     <w:p>
@@ -3776,7 +3776,7 @@
           <w:i w:val="0"/>
           <w:sz w:val="24"/>
         </w:rPr>
-        <w:t>My personal goals were to deepen my React and Express engineering skills, understand end-to-end data flow from UI action to persisted state and back, and learn to encode organisational rules - such as HOD category scoping and workload caps - as enforceable server-side logic rather than as informal convention.</w:t>
+        <w:t>For myself, I set three goals: get noticeably better at React and Express, understand the full path of data from a click in the UI to stored state and back, and learn to write organisational rules, like HOD category scoping or workload caps, as server-side checks instead of informal conventions that people forget.</w:t>
       </w:r>
     </w:p>
     <w:p>
@@ -3790,7 +3790,7 @@
           <w:i w:val="0"/>
           <w:sz w:val="24"/>
         </w:rPr>
-        <w:t>1.2.5  Scope Included in the Completed Project</w:t>
+        <w:t>1.2.5  What the Completed Project Covers</w:t>
       </w:r>
     </w:p>
     <w:p>
@@ -3806,7 +3806,7 @@
           <w:i w:val="0"/>
           <w:sz w:val="24"/>
         </w:rPr>
-        <w:t>The implemented scope covers the main tender lifecycle rather than every capability of a production e-procurement suite. Table 1.2 summarises the included areas.</w:t>
+        <w:t>What I delivered covers the main tender lifecycle. It does not try to be a complete e-procurement suite. Table 1.2 lists the areas that were actually built.</w:t>
       </w:r>
     </w:p>
     <w:p>
@@ -3820,7 +3820,7 @@
           <w:i w:val="0"/>
           <w:sz w:val="24"/>
         </w:rPr>
-        <w:t>Table 1.2: Summary of included project scope</w:t>
+        <w:t>Table 1.2: Work included in the completed prototype</w:t>
       </w:r>
     </w:p>
     <w:tbl>
@@ -4164,7 +4164,7 @@
           <w:i w:val="0"/>
           <w:sz w:val="24"/>
         </w:rPr>
-        <w:t>1.2.6  Scope Boundaries and Exclusions</w:t>
+        <w:t>1.2.6  What Was Left Out and Why</w:t>
       </w:r>
     </w:p>
     <w:p>
@@ -4180,7 +4180,7 @@
           <w:i w:val="0"/>
           <w:sz w:val="24"/>
         </w:rPr>
-        <w:t>The current build intentionally stores data in a typed in-memory store, so state resets on restart; a SQL Server-backed persistence layer managed through SQL Server Management Studio (SSMS) is the stated production direction and is recorded as future work. Seed credentials are demonstration-grade, passwords are stored in plaintext in the seed file, and the companion documentation lists a few demo accounts that differ from the seed data. The milestones collection is declared but not yet populated, the Viewer role exists in code and UI without a seeded account, and one legacy calendar component remains unreferenced. These items are documented honestly as prototype artifacts, not presented as completed production features.</w:t>
+        <w:t>The build stores data in a typed in-memory store on purpose, so everything resets on restart; moving to a SQL Server database administered through SQL Server Management Studio (SSMS) is the stated production direction and is recorded as future work. The seed credentials are only for demonstration, passwords sit in plaintext in the seed file, and the companion documentation mentions a few demo accounts that do not match the seed data. The milestones collection is declared but never filled, the Viewer role exists in code and UI without a seeded account, and one old calendar component is no longer referenced from anywhere. I have listed all of these honestly as prototype artifacts rather than as shipped production capability.</w:t>
       </w:r>
     </w:p>
     <w:p>
@@ -4194,7 +4194,7 @@
           <w:i w:val="0"/>
           <w:sz w:val="24"/>
         </w:rPr>
-        <w:t>1.2.7  Internship and Project Summary</w:t>
+        <w:t>1.2.7  A Quick Summary of the Internship</w:t>
       </w:r>
     </w:p>
     <w:p>
@@ -4208,7 +4208,7 @@
           <w:i w:val="0"/>
           <w:sz w:val="24"/>
         </w:rPr>
-        <w:t>Table 1.3: Internship and project overview</w:t>
+        <w:t>Table 1.3: Internship and project at a glance</w:t>
       </w:r>
     </w:p>
     <w:tbl>
@@ -4252,7 +4252,7 @@
                 <w:sz w:val="21"/>
                 <w:color w:val="FFFFFF"/>
               </w:rPr>
-              <w:t>Attribute</w:t>
+              <w:t>Item</w:t>
             </w:r>
           </w:p>
         </w:tc>
@@ -4278,7 +4278,7 @@
                 <w:sz w:val="21"/>
                 <w:color w:val="FFFFFF"/>
               </w:rPr>
-              <w:t>Recorded detail</w:t>
+              <w:t>Detail as recorded</w:t>
             </w:r>
           </w:p>
         </w:tc>
@@ -4521,7 +4521,7 @@
           <w:i w:val="0"/>
           <w:sz w:val="24"/>
         </w:rPr>
-        <w:t>The project therefore combines product design and full-stack implementation. The chapters that follow describe the ideas behind the platform, the technology choices, the system design, the implemented workflows, the results obtained, and the validation performed.</w:t>
+        <w:t>In short, the project mixes product thinking with full-stack implementation. The next chapters explain the ideas behind the platform, the technology choices, the design, the implementation, the results and the validation.</w:t>
       </w:r>
     </w:p>
     <w:p>
@@ -4581,7 +4581,7 @@
           <w:i w:val="0"/>
           <w:sz w:val="24"/>
         </w:rPr>
-        <w:t>Tender Management draws on research and practice in access control, web architecture, authentication, component-based user interfaces, task visualisation, and analytics. This review focuses on the ideas that influenced the project's design and on the limits those ideas make visible.</w:t>
+        <w:t>The design of Tender Management borrows from several well-known areas: access control, web architecture, authentication, component-based interfaces, task visualisation and analytics. This review stays close to the project and discusses only the ideas that actually shaped the design, together with the limits they expose.</w:t>
       </w:r>
     </w:p>
     <w:p>
@@ -4611,7 +4611,7 @@
           <w:i w:val="0"/>
           <w:sz w:val="24"/>
         </w:rPr>
-        <w:t>Organisational tracking systems have grown from static records into platforms that coordinate structures, assignments, execution, evaluation, and reporting. In construction and infrastructure, the bid pipeline is a particularly strong example: a tender moves through named stages, each with its own owners and artefacts, and the value of a platform lies in making the stage state, the owners, and the deadlines visible to every stakeholder at once. Figure 2.1 contrasts the fragmented practice the project replaces with the unified platform it delivers.</w:t>
+        <w:t>Tracking systems inside organisations have slowly grown from static record keeping into platforms that coordinate structure, assignment, execution, evaluation and reporting. The bid pipeline in construction is a good example of this growth: a tender passes through named stages, each with its own owners and documents, and a platform earns its keep by making the current stage, the owners and the deadlines visible to everybody at once. Figure 2.1 contrasts the scattered practice the project replaces with the single platform that was built.</w:t>
       </w:r>
     </w:p>
     <w:p>
@@ -4666,7 +4666,7 @@
           <w:i w:val="0"/>
           <w:sz w:val="24"/>
         </w:rPr>
-        <w:t>Figure 2.1: From fragmented tracking to a unified tender platform</w:t>
+        <w:t>Figure 2.1: Replacing scattered tracking with one platform</w:t>
       </w:r>
     </w:p>
     <w:p>
@@ -4696,7 +4696,7 @@
           <w:i w:val="0"/>
           <w:sz w:val="24"/>
         </w:rPr>
-        <w:t>A system shared by five roles must decide, for every operation, who may perform it. Role-Based Access Control (RBAC) formalises this by granting permissions to roles rather than to individuals, so that organisational policy is expressed once and enforced uniformly [2]. Tender Management applies RBAC at two layers: server-side middleware rejects operations outside a caller's role, and client-side route registration hides interfaces a role cannot use. The review confirms that RBAC is a usability and organisation mechanism; it must always be backed by server-side enforcement, which the project does.</w:t>
+        <w:t>When five different roles share one system, every operation needs an answer to the question: who is allowed to do this? Role-Based Access Control (RBAC) answers it by attaching permissions to roles instead of persons, so policy is written once and applied everywhere [2]. In this project RBAC works at two layers. Server-side middleware rejects any operation that is outside the caller's role, and client-side route registration hides screens a role cannot use anyway. The literature also warns that RBAC is mainly an organisation and usability mechanism; real protection must come from the server, and in this project it does.</w:t>
       </w:r>
     </w:p>
     <w:p>
@@ -4726,7 +4726,7 @@
           <w:i w:val="0"/>
           <w:sz w:val="24"/>
         </w:rPr>
-        <w:t>Stateless sessions let a browser prove its identity on every request without server-side session storage. JSON Web Tokens define a compact signed format carrying claims such as user identity and role, with expiry [3]. Security guidance emphasises signature and algorithm validation, expiry checks, strong keys, and safe transport [4]. The project issues an eight-hour Bearer token containing identity and role claims, validates it on every protected route, and keeps role checks server-side; the review also notes that production deployments must move from a fallback secret to an environment-managed key and hash stored credentials.</w:t>
+        <w:t>Stateless sessions allow a browser to prove who it is on every request without the server storing session state. JSON Web Tokens give a compact signed format that carries claims such as identity and role, along with an expiry time [3]. Security guidance stresses validating the signature and the algorithm, checking expiry, using strong keys and transporting tokens safely [4]. The project issues a Bearer token with an eight-hour life that carries identity and role claims, verifies it on every protected route, and keeps all role checks on the server. The same guidance also makes clear that a production deployment must replace the fallback secret with an environment-managed key and must hash stored credentials.</w:t>
       </w:r>
     </w:p>
     <w:p>
@@ -4756,7 +4756,7 @@
           <w:i w:val="0"/>
           <w:sz w:val="24"/>
         </w:rPr>
-        <w:t>React's component model supports building an interface from reusable parts [5]. In Tender Management, shared panels, status pills, modals, and a stepper for the bid pipeline reduce repeated work and keep the five dashboards visually related. Domain components such as the project detail modal and the experience modal sit above general primitives. Reuse is most useful when a component has a clear job; the project's stepper, reused across four dashboards in read-only and interactive modes, is a good example.</w:t>
+        <w:t>React's component model lets an interface be assembled from reusable parts [5]. In Tender Management, shared panels, status pills, modals and a stepper for the bid pipeline avoid repeated code and keep the five dashboards visually related. Domain components such as the project detail modal sit on top of general primitives. I found reuse most valuable when a component had one clear job; the pipeline stepper, used in four dashboards in both read-only and interactive modes, is the best example in the codebase.</w:t>
       </w:r>
     </w:p>
     <w:p>
@@ -4786,7 +4786,7 @@
           <w:i w:val="0"/>
           <w:sz w:val="24"/>
         </w:rPr>
-        <w:t>Modern build tools such as Vite shorten the loop between edit and feedback and, in middleware mode, allow a single development server to host both the API and the interface [6]. Client-side routers then map URLs to screens inside one document, which suits role-gated dashboards because route availability can react to the signed-in identity [5]. The project uses Vite middleware inside Express during development and a static bundle in production, with role-conditional route registration on the client.</w:t>
+        <w:t>Modern build tools like Vite shorten the gap between editing code and seeing the result, and in middleware mode a single development server can host both the API and the interface [6]. A client-side router then maps URLs to screens inside one document. This fits role-gated dashboards well, because the set of routes can react to whoever is signed in [5]. The project runs Vite as middleware inside Express during development and serves a static bundle in production, while the client registers routes conditionally on the role.</w:t>
       </w:r>
     </w:p>
     <w:p>
@@ -4816,7 +4816,7 @@
           <w:i w:val="0"/>
           <w:sz w:val="24"/>
         </w:rPr>
-        <w:t>Utility-first CSS keeps styling decisions local to the markup and supports design tokens for a consistent palette [7]. The project defines corporate tokens - a primary blue, a dark navy, warning amber - and applies them consistently across dashboards, pills, and charts, which keeps a large surface visually coherent without a separate stylesheet per page.</w:t>
+        <w:t>Utility-first CSS keeps styling decisions next to the markup and supports design tokens for a consistent palette [7]. The project defines a small set of corporate tokens, a primary blue, a dark navy and a warning amber, and uses them across dashboards, pills and charts. This keeps a large interface visually coherent without maintaining a separate stylesheet for every page.</w:t>
       </w:r>
     </w:p>
     <w:p>
@@ -4846,7 +4846,7 @@
           <w:i w:val="0"/>
           <w:sz w:val="24"/>
         </w:rPr>
-        <w:t>Representational State Transfer (REST) separates the browser from server implementation through resource-oriented endpoints, stateless requests, and layered systems [8]. Tender Management exposes resource-style routes for users, projects, teams, tasks, notifications, and analytics, with a shared fetch convention on the client that applies the Bearer header and parses errors uniformly. Stable request and response contracts remain the main maintenance asset of such a design.</w:t>
+        <w:t>Representational State Transfer (REST) keeps the browser independent of the server's internals through resource-oriented endpoints, stateless requests and layered systems [8]. Tender Management exposes resource-style routes for users, projects, teams, tasks, notifications and analytics, and the client uses one shared fetch convention that adds the Bearer header and parses errors uniformly. In my experience the stable request and response contracts are the main maintenance asset of this style.</w:t>
       </w:r>
     </w:p>
     <w:p>
@@ -4876,7 +4876,7 @@
           <w:i w:val="0"/>
           <w:sz w:val="24"/>
         </w:rPr>
-        <w:t>Express provides a minimal, middleware-oriented host for REST services [9]. The project chains a JSON body parser, an authentication middleware, and a role middleware before route handlers, which keeps permission logic out of business code. The review notes that as route counts grow, monolithic route files benefit from decomposition into domain routers - a consolidation item recorded for future work.</w:t>
+        <w:t>Express offers a small, middleware-oriented host for REST services [9]. The project chains a JSON body parser, an authentication middleware and a role middleware before the route handlers, which keeps permission logic out of the business code. The literature on growing Express codebases notes that a single large route file eventually wants to be split into domain routers; that split is recorded here as future work.</w:t>
       </w:r>
     </w:p>
     <w:p>
@@ -4906,7 +4906,7 @@
           <w:i w:val="0"/>
           <w:sz w:val="24"/>
         </w:rPr>
-        <w:t>Kanban systems make work-in-progress visible by placing tasks on boards whose columns represent states, and they use explicit limits to expose overload [10]. Gantt-style timelines complement boards by showing task duration and overlap against a calendar axis, which remains a standard technique in project control literature [11]. Tender Management implements both natively: a drag-and-drop Kanban for task states and a proportional-bar Gantt derived from task start and end dates, plus month calendars that merge pipeline deadlines with task due dates.</w:t>
+        <w:t>Kanban boards make work in progress visible by placing tasks on a board whose columns represent states, and they use explicit limits so overload becomes obvious [10]. Gantt timelines complement boards by showing duration and overlap against a calendar axis, which is still a standard technique in project control [11]. The project implements both natively: a drag-and-drop Kanban for task states, a proportional-bar Gantt built from task start and end dates, and month calendars that mix pipeline deadlines with task due dates.</w:t>
       </w:r>
     </w:p>
     <w:p>
@@ -4936,7 +4936,7 @@
           <w:i w:val="0"/>
           <w:sz w:val="24"/>
         </w:rPr>
-        <w:t>Declarative chart libraries such as Recharts let applications render trends, mixes, and comparisons directly from data arrays [12]. The project derives three analytics dashboards - executive overview, tender outcomes, and user performance - from shared records. The literature cautions that metric definitions must be explicit; the project therefore computes success rates, failure-rank distributions, and average ratings in one backend place so every dashboard reads the same definitions.</w:t>
+        <w:t>Declarative chart libraries such as Recharts let an application draw trends, mixes and comparisons straight from data arrays [12]. The project derives three analytics dashboards, an executive overview, tender outcomes and user performance, from shared records. The literature cautions that metric definitions must be written down explicitly; for that reason the project computes success rates, failure-rank distributions and average ratings in one place on the backend, so every dashboard reads the same numbers.</w:t>
       </w:r>
     </w:p>
     <w:p>
@@ -4950,7 +4950,7 @@
           <w:i w:val="0"/>
           <w:sz w:val="24"/>
         </w:rPr>
-        <w:t>2.12  Synthesis and Research Gap</w:t>
+        <w:t>2.12  What the Literature Leaves Open</w:t>
       </w:r>
     </w:p>
     <w:p>
@@ -4966,7 +4966,7 @@
           <w:i w:val="0"/>
           <w:sz w:val="24"/>
         </w:rPr>
-        <w:t>The reviewed approaches agree on a practical balance: role-focused workflows make a shared system usable; middleware-enforced RBAC and signed tokens make it safe to expose; reusable components and stable contracts make it maintainable; and boards, timelines, and charts make its state legible. The gap addressed by this project is the connection of those ideas to the specific rules of infrastructure tendering - category-scoped departmental authority, a stage-gated bid pipeline, workload caps during team formation, and the automatic conversion of completed work into reusable experience records.</w:t>
+        <w:t>Taken together, the reviewed material settles on a practical balance: role-focused workflows make a shared system usable, middleware-enforced RBAC and signed tokens make it safe to expose, reusable components and stable contracts make it maintainable, and boards, timelines and charts make its state readable. What the literature does not provide is the connection of these ideas to the specific rules of infrastructure tendering, namely category-scoped departmental authority, a stage-gated bid pipeline, workload caps while teams are formed, and the automatic conversion of finished work into reusable experience records. That connection is the gap this project fills.</w:t>
       </w:r>
     </w:p>
     <w:p>
@@ -4980,7 +4980,7 @@
           <w:i w:val="0"/>
           <w:sz w:val="24"/>
         </w:rPr>
-        <w:t>Table 2.1: Fragmented and integrated tender administration</w:t>
+        <w:t>Table 2.1: Manual practice versus the implemented platform</w:t>
       </w:r>
     </w:p>
     <w:tbl>
@@ -5464,7 +5464,7 @@
           <w:i w:val="0"/>
           <w:sz w:val="24"/>
         </w:rPr>
-        <w:t>This chapter describes the host organization, the internship environment, and every significant technology used during the project, together with the reason each was chosen and the boundary it currently exhibits.</w:t>
+        <w:t>This chapter first describes the host organisation and the working environment of the internship, and then walks through every technology that mattered in the project, with the reason it was picked and the boundary it shows today.</w:t>
       </w:r>
     </w:p>
     <w:p>
@@ -5494,7 +5494,7 @@
           <w:i w:val="0"/>
           <w:sz w:val="24"/>
         </w:rPr>
-        <w:t>Larsen &amp; Toubro is a multinational conglomerate headquartered in Mumbai, India, active in infrastructure, energy, and technology [1]. The internship was hosted by the Digital Teams of the RBF SBG Transportation IC, which builds digital tools for the transportation businesses. The work-from-office mode allowed daily clarification of tendering rules that would be difficult to capture remotely.</w:t>
+        <w:t>Larsen &amp; Toubro is a multinational group headquartered in Mumbai, active in infrastructure, energy and technology [1]. The internship was hosted by the Digital Teams of RBF SBG Transportation IC, which builds digital tools for the transportation businesses. Because I worked from office, tendering rules that would have been hard to capture over mail could be clarified in a five-minute conversation at the desk next to me.</w:t>
       </w:r>
     </w:p>
     <w:p>
@@ -5524,7 +5524,7 @@
           <w:i w:val="0"/>
           <w:sz w:val="24"/>
         </w:rPr>
-        <w:t>The team worked iteratively around feature areas - dashboards, pipeline, tasks, analytics, deployment - with review conversations replacing formal ceremony. My role covered the full stack: I translated workflow rules into routes and screens, implemented the business logic, and prepared the containerised delivery.</w:t>
+        <w:t>The team worked iteratively around feature areas such as dashboards, pipeline, tasks, analytics and deployment, with short review conversations instead of formal ceremony. My role spanned the full stack: I translated workflow rules into routes and screens, implemented the business logic, and prepared the containerised delivery.</w:t>
       </w:r>
     </w:p>
     <w:p>
@@ -5554,7 +5554,7 @@
           <w:i w:val="0"/>
           <w:sz w:val="24"/>
         </w:rPr>
-        <w:t>The stack is deliberately compact: one React single-page application, one Express API, one typed in-memory store, and container-based delivery. Figure 3.1 shows the layers.</w:t>
+        <w:t>The stack was kept small on purpose: one React single-page application, one Express API, one typed in-memory store and container-based delivery. Figure 3.1 shows how the layers sit on top of each other.</w:t>
       </w:r>
     </w:p>
     <w:p>
@@ -5609,7 +5609,7 @@
           <w:i w:val="0"/>
           <w:sz w:val="24"/>
         </w:rPr>
-        <w:t>Figure 3.1: Layered technology stack of Tender Manager</w:t>
+        <w:t>Figure 3.1: Layers of the implemented stack</w:t>
       </w:r>
     </w:p>
     <w:p>
@@ -5653,7 +5653,7 @@
           <w:i w:val="0"/>
           <w:sz w:val="24"/>
         </w:rPr>
-        <w:t>React 19 provides the component runtime and hooks used for all state handling [5]. Functional components with local state keep each dashboard self-contained, while the router re-renders the tree when the signed-in identity changes.</w:t>
+        <w:t>React 19 provides the component runtime and the hooks used for all state handling [5]. Functional components with local state keep each dashboard self-contained, and the router re-renders the tree whenever the signed-in identity changes.</w:t>
       </w:r>
     </w:p>
     <w:p>
@@ -5683,7 +5683,7 @@
           <w:i w:val="0"/>
           <w:sz w:val="24"/>
         </w:rPr>
-        <w:t>Vite 6 serves the frontend during development through Express middleware and proxies /api and /auth to the backend, so one port hosts the whole system [6]. For production, Vite builds a static bundle that the same Express server serves, removing any cross-origin complexity.</w:t>
+        <w:t>During development, Vite 6 serves the frontend through Express middleware and proxies /api and /auth to the backend, so the whole system sits behind one port [6]. For production, Vite produces a static bundle that the same Express server serves, which removes cross-origin problems entirely.</w:t>
       </w:r>
     </w:p>
     <w:p>
@@ -5713,7 +5713,7 @@
           <w:i w:val="0"/>
           <w:sz w:val="24"/>
         </w:rPr>
-        <w:t>TypeScript adds static typing across both tiers [13]. The project uses pragmatic typing - strict where structures are stable and permissive where the schema evolves - which kept iteration fast while catching most integration mistakes early.</w:t>
+        <w:t>TypeScript adds static typing on both tiers [13]. I used pragmatic typing: strict where the structures are stable, permissive where the schema was still moving. That mix kept iteration fast and still caught most integration mistakes early.</w:t>
       </w:r>
     </w:p>
     <w:p>
@@ -5743,7 +5743,7 @@
           <w:i w:val="0"/>
           <w:sz w:val="24"/>
         </w:rPr>
-        <w:t>Tailwind CSS 4 with an @theme block supplies the corporate palette and typography; lucide-react supplies consistent iconography; and the motion library is available for transitions. Custom utility classes in a global stylesheet define panels, data tables, and status pills used uniformly by every page.</w:t>
+        <w:t>Tailwind CSS 4 with an @theme block supplies the corporate palette and typography, lucide-react supplies consistent icons, and the motion library is available for transitions. A global stylesheet defines custom utility classes for panels, data tables and status pills, and every page uses them.</w:t>
       </w:r>
     </w:p>
     <w:p>
@@ -5773,7 +5773,7 @@
           <w:i w:val="0"/>
           <w:sz w:val="24"/>
         </w:rPr>
-        <w:t>Recharts renders the analytics dashboards and the HOD statistics panel [12]. The Kanban board, Gantt chart, and calendars are implemented natively with HTML5 drag events and proportional layout, avoiding heavy chart dependencies for operational views.</w:t>
+        <w:t>Recharts renders the analytics dashboards and the HOD statistics panel [12]. The Kanban board, the Gantt chart and the calendars were implemented natively with HTML5 drag events and proportional layout, because the operational views did not need another heavy chart dependency.</w:t>
       </w:r>
     </w:p>
     <w:p>
@@ -5803,7 +5803,7 @@
           <w:i w:val="0"/>
           <w:sz w:val="24"/>
         </w:rPr>
-        <w:t>The backend runs on Node.js (node:22-alpine in containers) with Express 4 [9]. The tsx runner executes TypeScript directly in development, and esbuild bundles the server into a CommonJS artifact for production. jsonwebtoken signs and verifies the Bearer tokens; cors and dotenv complete the runtime perimeter.</w:t>
+        <w:t>The backend runs on Node.js, using the node:22-alpine image inside containers, with Express 4 [9]. The tsx runner executes TypeScript directly during development, and esbuild bundles the server into a CommonJS artifact for production. jsonwebtoken signs and verifies the Bearer tokens, while cors and dotenv complete the runtime perimeter.</w:t>
       </w:r>
     </w:p>
     <w:p>
@@ -5833,7 +5833,7 @@
           <w:i w:val="0"/>
           <w:sz w:val="24"/>
         </w:rPr>
-        <w:t>The data layer is a typed in-memory object holding thirteen collections and nine identifier counters. This choice gives the prototype zero configuration, instant resets for demonstrations, and a schema that maps cleanly onto relational tables. The organization's production direction is a SQL Server database administered through SQL Server Management Studio (SSMS); the current store therefore doubles as a precise specification of that future schema.</w:t>
+        <w:t>The data layer is a typed in-memory object holding thirteen collections and nine identifier counters. This gave the prototype zero configuration, instant resets for demonstrations, and a schema that maps cleanly onto relational tables later. Since the organisation's production direction is a SQL Server database administered through SSMS, the current store also doubles as a precise written specification of that future schema.</w:t>
       </w:r>
     </w:p>
     <w:p>
@@ -5863,7 +5863,7 @@
           <w:i w:val="0"/>
           <w:sz w:val="24"/>
         </w:rPr>
-        <w:t>A multi-stage Dockerfile builds the bundle and runs it on a minimal image with health and readiness probes; a compose file runs three replicas behind an nginx least-connection load balancer [14], [15]. This topology demonstrates horizontal scaling and health-gated routing for the API and static assets.</w:t>
+        <w:t>A multi-stage Dockerfile builds the bundle and runs it on a minimal image with health and readiness probes, and a compose file runs three replicas behind an nginx least-connection load balancer [14], [15]. This topology was used to demonstrate horizontal scaling and health-gated routing for both the API and the static assets.</w:t>
       </w:r>
     </w:p>
     <w:p>
@@ -5877,7 +5877,7 @@
           <w:i w:val="0"/>
           <w:sz w:val="24"/>
         </w:rPr>
-        <w:t>3.11  Technology Selection Rationale</w:t>
+        <w:t>3.11  Why These Technologies</w:t>
       </w:r>
     </w:p>
     <w:p>
@@ -5893,7 +5893,7 @@
           <w:i w:val="0"/>
           <w:sz w:val="24"/>
         </w:rPr>
-        <w:t>The stack was chosen to support a broad interface, explicit business rules, and a practical deployment path. Its trade-offs are recognised: the in-memory store does not persist, one route file concentrates logic, and demonstration credentials are not production security. Recognising those limits is part of an accurate technology review.</w:t>
+        <w:t>I picked the stack to support a broad interface, explicit business rules and a realistic deployment path, and I accepted its trade-offs knowingly: the in-memory store does not persist, one route file concentrates the logic, and the demonstration credentials are not production security. Naming those limits openly is part of an honest technology review.</w:t>
       </w:r>
     </w:p>
     <w:p>
@@ -5907,7 +5907,7 @@
           <w:i w:val="0"/>
           <w:sz w:val="24"/>
         </w:rPr>
-        <w:t>Table 3.1: Key technologies and their roles</w:t>
+        <w:t>Table 3.1: Technologies used and the job each one does</w:t>
       </w:r>
     </w:p>
     <w:tbl>
@@ -6708,7 +6708,7 @@
           <w:i w:val="0"/>
           <w:sz w:val="24"/>
         </w:rPr>
-        <w:t>Table 3.2: Backend route domains and endpoint counts</w:t>
+        <w:t>Table 3.2: Endpoint counts per backend area</w:t>
       </w:r>
     </w:p>
     <w:tbl>
@@ -7348,7 +7348,7 @@
           <w:i w:val="0"/>
           <w:sz w:val="24"/>
         </w:rPr>
-        <w:t>A compact, typed stack supports a broad prototype: one SPA, one API, one store, and container delivery. The next chapter turns this stack into a design.</w:t>
+        <w:t>A compact, typed stack carries a broad prototype: one SPA, one API, one store and container delivery. The next chapter turns this stack into a design.</w:t>
       </w:r>
     </w:p>
     <w:p>
@@ -7408,7 +7408,7 @@
           <w:i w:val="0"/>
           <w:sz w:val="24"/>
         </w:rPr>
-        <w:t>The design had to connect five user groups, a stage-gated lifecycle, workload rules, and several visualisations. The following sections describe the development approach and the principal decisions.</w:t>
+        <w:t>I had to connect five user groups, a stage-gated lifecycle, workload rules and several visualisations without making the result hard to follow. The sections below describe how the work was organised and the decisions that mattered most.</w:t>
       </w:r>
     </w:p>
     <w:p>
@@ -7438,7 +7438,7 @@
           <w:i w:val="0"/>
           <w:sz w:val="24"/>
         </w:rPr>
-        <w:t>The team used an iterative, feature-oriented approach. Work was grouped around areas such as dashboards, pipeline, tasks, experience, and deployment; for each area the user task was clarified, a screen and data flow were built, the available endpoints were connected, and the integrated result was reviewed. Figure 4.1 shows the cycle.</w:t>
+        <w:t>Work proceeded in short iterations around feature areas. For each area we first clarified the user task, then I built the screen and the data flow, connected the available endpoints, and we reviewed the integrated result together. Figure 4.1 shows the cycle, and Table 4.1 lists what each phase produced.</w:t>
       </w:r>
     </w:p>
     <w:p>
@@ -7493,7 +7493,7 @@
           <w:i w:val="0"/>
           <w:sz w:val="24"/>
         </w:rPr>
-        <w:t>Figure 4.1: Iterative feature-oriented development cycle</w:t>
+        <w:t>Figure 4.1: How each feature area was built and reviewed</w:t>
       </w:r>
     </w:p>
     <w:p>
@@ -7507,7 +7507,7 @@
           <w:i w:val="0"/>
           <w:sz w:val="24"/>
         </w:rPr>
-        <w:t>Table 4.1: Development phases and representative outputs</w:t>
+        <w:t>Table 4.1: Iteration phases and what each produced</w:t>
       </w:r>
     </w:p>
     <w:tbl>
@@ -7838,7 +7838,7 @@
           <w:i w:val="0"/>
           <w:sz w:val="24"/>
         </w:rPr>
-        <w:t>•  Provide separate dashboards for Creator, HOD, Senior Lead, Team Lead, and Member with role-relevant navigation, plus a Viewer read-only mode.</w:t>
+        <w:t>•  Separate dashboards for Creator, HOD, Senior Lead, Team Lead and Member with role-relevant navigation, plus a read-only Viewer mode.</w:t>
       </w:r>
     </w:p>
     <w:p>
@@ -7853,7 +7853,7 @@
           <w:i w:val="0"/>
           <w:sz w:val="24"/>
         </w:rPr>
-        <w:t>•  Create tenders with category, value, geography, dates, description, and a customizable stage pipeline; assign codes automatically.</w:t>
+        <w:t>•  Tender creation with category, value, geography, dates, description and a customizable stage pipeline, with codes generated automatically.</w:t>
       </w:r>
     </w:p>
     <w:p>
@@ -7868,7 +7868,7 @@
           <w:i w:val="0"/>
           <w:sz w:val="24"/>
         </w:rPr>
-        <w:t>•  Assign Senior Leads, form teams with a Team Lead and members, and enforce a five-active-project workload cap.</w:t>
+        <w:t>•  Senior Lead assignment, team formation with a Team Lead and members, and a hard cap of five active projects per person.</w:t>
       </w:r>
     </w:p>
     <w:p>
@@ -7883,7 +7883,7 @@
           <w:i w:val="0"/>
           <w:sz w:val="24"/>
         </w:rPr>
-        <w:t>•  Track tasks with stage association, priority, dates, and drag-and-drop status changes; require a star rating when a Team Lead completes a task.</w:t>
+        <w:t>•  Tasks with stage association, priority, dates and drag-and-drop status changes, plus a compulsory star rating when a Team Lead closes a task.</w:t>
       </w:r>
     </w:p>
     <w:p>
@@ -7898,7 +7898,7 @@
           <w:i w:val="0"/>
           <w:sz w:val="24"/>
         </w:rPr>
-        <w:t>•  Gate project completion on pipeline completion; record Success/Fail outcomes with ranking and remarks.</w:t>
+        <w:t>•  Project completion gated on pipeline completion, and Success/Fail outcome recording with ranking and remarks.</w:t>
       </w:r>
     </w:p>
     <w:p>
@@ -7913,7 +7913,7 @@
           <w:i w:val="0"/>
           <w:sz w:val="24"/>
         </w:rPr>
-        <w:t>•  Maintain notifications, activity trails, experience and leadership records, and analytics.</w:t>
+        <w:t>•  Notifications, activity trails, experience and leadership records, and analytics.</w:t>
       </w:r>
     </w:p>
     <w:p>
@@ -7943,7 +7943,7 @@
           <w:i w:val="0"/>
           <w:sz w:val="24"/>
         </w:rPr>
-        <w:t>Usability, maintainability, responsiveness, data integrity, and security were considered during design. Role-specific dashboards and consistent controls address usability; middleware-enforced rules address integrity and security; the container topology addresses deployability. Production-grade persistence, observability, and accessibility testing remain future work.</w:t>
+        <w:t>Usability, maintainability, responsiveness, data integrity and security were considered from the start. Role-specific dashboards and consistent controls address usability, middleware-enforced rules address integrity and security, and the container topology addresses deployability. Production-grade persistence, observability and accessibility testing were left for future work, and the report says so plainly.</w:t>
       </w:r>
     </w:p>
     <w:p>
@@ -7973,7 +7973,7 @@
           <w:i w:val="0"/>
           <w:sz w:val="24"/>
         </w:rPr>
-        <w:t>The principal actors are the five operational roles; the Viewer observes without mutation. Figure 4.2 maps actors to their high-level use cases and to the cross-cutting system behaviours - notifications, experience synchronisation, workload guard, and analytics.</w:t>
+        <w:t>The main actors are the five working roles, with the Viewer observing without changing anything. Figure 4.2 maps each actor to its high-level use cases and to the cross-cutting behaviours of the system: notifications, experience synchronisation, the workload guard and analytics.</w:t>
       </w:r>
     </w:p>
     <w:p>
@@ -8028,7 +8028,7 @@
           <w:i w:val="0"/>
           <w:sz w:val="24"/>
         </w:rPr>
-        <w:t>Figure 4.2: Principal actors and high-level use cases</w:t>
+        <w:t>Figure 4.2: Roles and their main use cases</w:t>
       </w:r>
     </w:p>
     <w:p>
@@ -8058,7 +8058,7 @@
           <w:i w:val="0"/>
           <w:sz w:val="24"/>
         </w:rPr>
-        <w:t>The browser sends every request to one origin. Express serves the interface and the API from the same process; the authentication middleware verifies the Bearer token, the role middleware filters by role, and handlers apply business rules before mutating the store. In development the Vite middleware provides hot reloading; in production the static bundle is served. Figure 4.3 gives the architecture.</w:t>
+        <w:t>The browser sends every request to a single origin. Express serves the interface and the API from the same process; the authentication middleware verifies the Bearer token, the role middleware filters by role, and the handlers apply the business rules before touching the store. In development the Vite middleware provides hot reloading; in production the static bundle is served. Figure 4.3 draws the request path.</w:t>
       </w:r>
     </w:p>
     <w:p>
@@ -8113,7 +8113,7 @@
           <w:i w:val="0"/>
           <w:sz w:val="24"/>
         </w:rPr>
-        <w:t>Figure 4.3: Overall client-server architecture</w:t>
+        <w:t>Figure 4.3: Request path through the single Express origin</w:t>
       </w:r>
     </w:p>
     <w:p>
@@ -8143,7 +8143,7 @@
           <w:i w:val="0"/>
           <w:sz w:val="24"/>
         </w:rPr>
-        <w:t>The router registers dashboard routes conditionally on the signed-in role, and the Layout supplies the sidebar, the notification bell with five-second polling, and the user menu. Dashboards compose reusable pieces: the status stepper appears in four dashboards and the detail modal; the Kanban, Gantt, and calendar views are shared between the Team Lead and Member workspaces; and the experience modal serves both the employees directory and the profile page.</w:t>
+        <w:t>The router registers dashboard routes conditionally on the signed-in role, and the Layout supplies the sidebar, the notification bell with its five-second polling, and the user menu. The dashboards compose reusable pieces: the status stepper appears in four dashboards and in the detail modal, the Kanban, Gantt and calendar views are shared between the Team Lead and Member workspaces, and the experience modal serves both the employees directory and the profile page.</w:t>
       </w:r>
     </w:p>
     <w:p>
@@ -8173,7 +8173,7 @@
           <w:i w:val="0"/>
           <w:sz w:val="24"/>
         </w:rPr>
-        <w:t>The backend chains express.json, an auth middleware that verifies the JWT and injects the caller, and a requireRole factory for role gates. Handlers then apply validation helpers - pipeline normalisation, status validation, allocation checks, stage-completion checks - before mutating collections. Helper functions such as canHodManageProject encode organisational policy in one place.</w:t>
+        <w:t>The backend chains express.json, an auth middleware that verifies the JWT and injects the caller, and a requireRole factory for the role gates. The handlers then apply small validation helpers, pipeline normalisation, status validation, allocation checks and stage-completion checks, before mutating collections. Helper functions such as canHodManageProject keep each organisational policy in one place.</w:t>
       </w:r>
     </w:p>
     <w:p>
@@ -8203,7 +8203,7 @@
           <w:i w:val="0"/>
           <w:sz w:val="24"/>
         </w:rPr>
-        <w:t>Table 4.2 summarises the enforced matrix. HOD authority is scoped by category: one HOD owns Bridges and the other owns all remaining categories, a rule applied consistently to lead assignment, status changes, stage toggles, and completion.</w:t>
+        <w:t>Table 4.2 summarises the enforced matrix. HOD authority is scoped by category: one HOD owns Bridges while the other owns all remaining categories, and this one rule is applied consistently to lead assignment, status changes, stage toggles and completion.</w:t>
       </w:r>
     </w:p>
     <w:p>
@@ -8217,7 +8217,7 @@
           <w:i w:val="0"/>
           <w:sz w:val="24"/>
         </w:rPr>
-        <w:t>Table 4.2: Role-based access control matrix</w:t>
+        <w:t>Table 4.2: Who may do what in the implemented system</w:t>
       </w:r>
     </w:p>
     <w:tbl>
@@ -9653,7 +9653,7 @@
           <w:i w:val="0"/>
           <w:sz w:val="24"/>
         </w:rPr>
-        <w:t>Each project carries an ordered list of stages with optional deadlines; the default nine stages mirror the organization's bid process. Completion of every stage gates the Completed status, and toggling the final stage auto-completes the project. Bid Dropped is a separate, Creator-only, reversible state excluded from active views.</w:t>
+        <w:t>Every project carries an ordered list of stages with optional deadlines, and the default nine stages mirror the organisation's real bid process. All stages must be complete before the project can move to Completed, and toggling the final stage auto-completes the project. Bid Dropped is a separate Creator-only state that can be reverted, and dropped projects disappear from the active views.</w:t>
       </w:r>
     </w:p>
     <w:p>
@@ -9667,7 +9667,7 @@
           <w:i w:val="0"/>
           <w:sz w:val="24"/>
         </w:rPr>
-        <w:t>Table 4.3: Default bid pipeline stages</w:t>
+        <w:t>Table 4.3: The nine default stages of the bid pipeline</w:t>
       </w:r>
     </w:p>
     <w:tbl>
@@ -10360,7 +10360,7 @@
           <w:i w:val="0"/>
           <w:sz w:val="24"/>
         </w:rPr>
-        <w:t>Figure 4.4 traces the state flow from creation through outcome, including the reversible bid-drop branch and the experience credit on completion.</w:t>
+        <w:t>Figure 4.4 traces the states a tender passes through, from creation to outcome, including the reversible bid-drop branch and the experience credit that fires on completion.</w:t>
       </w:r>
     </w:p>
     <w:p>
@@ -10415,7 +10415,7 @@
           <w:i w:val="0"/>
           <w:sz w:val="24"/>
         </w:rPr>
-        <w:t>Figure 4.4: Tender lifecycle state flow</w:t>
+        <w:t>Figure 4.4: Status transitions across the tender lifecycle</w:t>
       </w:r>
     </w:p>
     <w:p>
@@ -10445,7 +10445,7 @@
           <w:i w:val="0"/>
           <w:sz w:val="24"/>
         </w:rPr>
-        <w:t>The store contains thirteen collections. Users hold identity and role; projects hold lifecycle state and stakeholder identifiers; teams map a project to a Team Lead and members; tasks carry execution detail and review fields; and the people-analytics collections - performance reviews, employee experiences, leadership history, and the legacy experience history - are maintained by the synchronisation engine. Notifications and the activity feed record events; categories carry name and color; milestones is declared for future use. Figure 4.5 shows the relationships.</w:t>
+        <w:t>The store contains thirteen collections. Users hold identity and role; projects hold lifecycle state and stakeholder identifiers; teams map a project to a Team Lead and members; tasks carry the execution detail and the review fields; and the people-analytics collections, namely performance reviews, employee experiences, leadership history and the legacy experience history, are maintained by the synchronisation engine. Notifications and the activity feed record events, categories carry name and color, and milestones is declared for later use. Figure 4.5 shows how the collections reference each other.</w:t>
       </w:r>
     </w:p>
     <w:p>
@@ -10500,7 +10500,7 @@
           <w:i w:val="0"/>
           <w:sz w:val="24"/>
         </w:rPr>
-        <w:t>Figure 4.5: High-level entity relationship model</w:t>
+        <w:t>Figure 4.5: Collections and how they reference each other</w:t>
       </w:r>
     </w:p>
     <w:p>
@@ -10530,7 +10530,7 @@
           <w:i w:val="0"/>
           <w:sz w:val="24"/>
         </w:rPr>
-        <w:t>Every significant transition - lead assignment, task assignment, task completion, status change, project completion - pushes a notification to the affected users, and task status changes append an activity entry for the actor. The layout polls for notifications so stakeholders see changes within seconds.</w:t>
+        <w:t>Every important transition, lead assignment, task assignment, task completion, status change and project completion, pushes a notification to the affected users, and task status changes append an activity entry for the actor. The layout polls for notifications, so stakeholders see changes within seconds.</w:t>
       </w:r>
     </w:p>
     <w:p>
@@ -10560,7 +10560,7 @@
           <w:i w:val="0"/>
           <w:sz w:val="24"/>
         </w:rPr>
-        <w:t>When a project completes or its tender succeeds, the synchronisation engine resolves participants - HOD, Senior Lead, Team Lead, and members - prunes records for participants no longer attached, upserts experience rows with category, role, and dates, upserts leadership rows with team size for leads, mirrors the legacy history, and raises completion notifications exactly once per user.</w:t>
+        <w:t>Whenever a project completes or its tender succeeds, the synchronisation engine resolves the participants, that is the HOD, the Senior Lead, the Team Lead and the members, removes records for people no longer attached, writes or updates experience rows with category, role and dates, writes or updates leadership rows with team size for the leads, mirrors the legacy history, and raises the completion notification exactly once per user.</w:t>
       </w:r>
     </w:p>
     <w:p>
@@ -10590,7 +10590,7 @@
           <w:i w:val="0"/>
           <w:sz w:val="24"/>
         </w:rPr>
-        <w:t>The production image bundles the server and the static client; three replicas run behind nginx with least-connection balancing and health-gated membership, as shown in Figure 4.6. The design demonstrates horizontal scale-out; because each replica currently owns its own memory, shared persistence is the first production requirement, as discussed in Chapter 8.</w:t>
+        <w:t>The production image bundles the server and the static client, and three replicas run behind nginx with least-connection balancing and health-gated membership, as drawn in Figure 4.6. The design shows how the system would scale out; but since each replica currently owns its own memory, shared persistence is the first production requirement, and Chapter 8 returns to that point.</w:t>
       </w:r>
     </w:p>
     <w:p>
@@ -10645,7 +10645,7 @@
           <w:i w:val="0"/>
           <w:sz w:val="24"/>
         </w:rPr>
-        <w:t>Figure 4.6: Load-balanced deployment topology</w:t>
+        <w:t>Figure 4.6: Replicas behind the nginx load balancer</w:t>
       </w:r>
     </w:p>
     <w:p>
@@ -10673,7 +10673,7 @@
           <w:i w:val="0"/>
           <w:sz w:val="24"/>
         </w:rPr>
-        <w:t>Table 4.4: Design decisions and trade-offs</w:t>
+        <w:t>Table 4.4: Choices made during design and their consequences</w:t>
       </w:r>
     </w:p>
     <w:tbl>
@@ -11127,7 +11127,7 @@
           <w:i w:val="0"/>
           <w:sz w:val="24"/>
         </w:rPr>
-        <w:t>The design connects five roles to a stage-gated lifecycle through enforced RBAC, a reconciling experience engine, and a scalable delivery topology. Chapter 5 describes how the design was implemented.</w:t>
+        <w:t>The design ties five roles to a stage-gated lifecycle through enforced RBAC, a reconciling experience engine and a scalable delivery topology. Chapter 5 explains how this design became working code.</w:t>
       </w:r>
     </w:p>
     <w:p>
@@ -11187,7 +11187,7 @@
           <w:i w:val="0"/>
           <w:sz w:val="24"/>
         </w:rPr>
-        <w:t>This chapter describes the implemented modules with reference to the source organisation, the principal algorithms, and the complete endpoint inventory.</w:t>
+        <w:t>This chapter walks through the implemented modules, starting from the source layout, then the main algorithms, and finally the complete endpoint inventory.</w:t>
       </w:r>
     </w:p>
     <w:p>
@@ -11217,7 +11217,7 @@
           <w:i w:val="0"/>
           <w:sz w:val="24"/>
         </w:rPr>
-        <w:t>The repository separates backend and frontend at the root, with shared constants on the client and delivery assets at the top level. Figure 5.1 maps the principal sources.</w:t>
+        <w:t>The repository keeps backend and frontend in separate folders at the root, with shared constants on the client and the delivery assets at the top level. Figure 5.1 maps the principal sources so the rest of the chapter is easier to follow.</w:t>
       </w:r>
     </w:p>
     <w:p>
@@ -11272,7 +11272,7 @@
           <w:i w:val="0"/>
           <w:sz w:val="24"/>
         </w:rPr>
-        <w:t>Figure 5.1: Principal source organisation</w:t>
+        <w:t>Figure 5.1: Layout of the source repository</w:t>
       </w:r>
     </w:p>
     <w:p>
@@ -11302,7 +11302,7 @@
           <w:i w:val="0"/>
           <w:sz w:val="24"/>
         </w:rPr>
-        <w:t>POST /auth/login validates the email and password against the seed users, signs an eight-hour token carrying id, role, and name, and computes isTeamLead by checking whether the user leads any team whose project is not completed. The client stores the token and user payload in localStorage and attaches the Bearer header on every request; the auth middleware verifies the token and rejects missing or invalid signatures with 401.</w:t>
+        <w:t>POST /auth/login checks the email and password against the seed users, signs an eight-hour token carrying id, role and name, and computes isTeamLead by looking at whether the user leads any team whose project is not yet completed. The client stores the token and the user payload in localStorage and attaches the Bearer header to every request, while the auth middleware verifies the token and answers 401 for missing or invalid signatures.</w:t>
       </w:r>
     </w:p>
     <w:p>
@@ -11332,7 +11332,7 @@
           <w:i w:val="0"/>
           <w:sz w:val="24"/>
         </w:rPr>
-        <w:t>The users directory enriches each user with category-grouped experience, leadership history, and a live active-project count used by the workload guard and the recommendation score. Profile assembly combines completed experiences, leadership rows, average task rating, and project buckets. The experiences and leadership endpoints join back into projects and teams to render durations, team composition, and outcomes, with a prior-experience fallback for seeded history.</w:t>
+        <w:t>The users directory enriches every user with category-grouped experience, leadership history and a live count of active projects, and that count is exactly what the workload guard and the recommendation score consume. Profile assembly combines completed experiences, leadership rows, the average task rating and project buckets. The experiences and leadership endpoints join back into projects and teams to render durations, team composition and outcomes, falling back to prior-experience records for seeded history.</w:t>
       </w:r>
     </w:p>
     <w:p>
@@ -11362,7 +11362,7 @@
           <w:i w:val="0"/>
           <w:sz w:val="24"/>
         </w:rPr>
-        <w:t>Project creation validates the name, generates the LT-YYYY-NNN code, normalises the pipeline stages (defaulting to the nine-stage list), auto-assigns the HOD by category - Bridges to one HOD, all other categories to the other - and notifies an assigned Senior Lead. Editing applies field-level guards; status transitions validate the status vocabulary, enforce the all-stages rule for Completed, restrict Bid Dropped to the Creator, and raise stakeholder notifications. Deletion cascades teams, tasks, activity, and notifications.</w:t>
+        <w:t>Project creation validates the name, generates the LT-YYYY-NNN code, normalises the pipeline stages to the nine-stage default when nothing is supplied, auto-assigns the HOD by category, with Bridges going to one HOD and every other category to the other, and notifies the chosen Senior Lead. Editing applies field-level guards. Status transitions validate the status vocabulary, enforce the all-stages rule for Completed, restrict Bid Dropped to the Creator, and raise stakeholder notifications. Deletion cascades through teams, tasks, activity and notifications.</w:t>
       </w:r>
     </w:p>
     <w:p>
@@ -11392,7 +11392,7 @@
           <w:i w:val="0"/>
           <w:sz w:val="24"/>
         </w:rPr>
-        <w:t>Team creation and update parse the lead and member identifiers, verify the caller's authority over the project, and run the allocation guard, which counts each candidate's active projects - excluding completed and bid-dropped ones - and rejects any assignment that would exceed five. Member removal protects the Team Lead identity until reassigned.</w:t>
+        <w:t>Team creation and update parse the lead and member identifiers, verify that the caller actually has authority over the project, and then run the allocation guard. The guard counts each candidate's active projects, ignoring completed and bid-dropped ones, and rejects any assignment that would cross five. Member removal refuses to strip the Team Lead identity until a new lead is set.</w:t>
       </w:r>
     </w:p>
     <w:p>
@@ -11422,7 +11422,7 @@
           <w:i w:val="0"/>
           <w:sz w:val="24"/>
         </w:rPr>
-        <w:t>Task creation is limited to the project's Team Lead or its Senior Lead, binds the task to the project's team and chosen stage, and notifies the assignee. Status updates are permitted to the Team Lead, senior management, or the assignee; when a Team Lead completes a task the handler requires a one-to-five rating and upserts a performance review that also stamps the task row. Status changes append activity entries and completion notifications.</w:t>
+        <w:t>Task creation is limited to the project's Team Lead or its Senior Lead, binds the task to the project's team and to the chosen stage, and notifies the assignee. Status updates are allowed for the Team Lead, senior management or the assignee; and when a Team Lead moves a task to completion the handler insists on a one-to-five rating and upserts a performance review that also stamps the task row. Every status change appends an activity entry and, where relevant, a completion notification.</w:t>
       </w:r>
     </w:p>
     <w:p>
@@ -11452,7 +11452,7 @@
           <w:i w:val="0"/>
           <w:sz w:val="24"/>
         </w:rPr>
-        <w:t>The engine is invoked from every mutation that can change participation or outcome: project creation, status updates, stage completion, team changes, lead assignment, bid revert, and successful outcomes. Figure 5.2 shows the trigger-resolution-reconcile-effect flow.</w:t>
+        <w:t>The engine is called from every mutation that can change participation or outcome: project creation, status updates, stage completion, team changes, lead assignment, bid revert and successful outcomes. Figure 5.2 shows the trigger, resolution, reconcile and effect flow that keeps the people records honest.</w:t>
       </w:r>
     </w:p>
     <w:p>
@@ -11507,7 +11507,7 @@
           <w:i w:val="0"/>
           <w:sz w:val="24"/>
         </w:rPr>
-        <w:t>Figure 5.2: Experience synchronisation engine</w:t>
+        <w:t>Figure 5.2: How experience records stay in sync</w:t>
       </w:r>
     </w:p>
     <w:p>
@@ -11537,7 +11537,7 @@
           <w:i w:val="0"/>
           <w:sz w:val="24"/>
         </w:rPr>
-        <w:t>Notification endpoints return the caller's feed and support single and bulk read. The tender analytics endpoint merges project-attached outcomes with the outcomes collection, scopes visibility by role, and computes participation, success and failure rates, rank distribution, and average failure position. The performance endpoint scopes reviews by role and produces member, task, project, and category aggregations with recent review details.</w:t>
+        <w:t>The notification endpoints return the caller's feed and support single and bulk read. The tender analytics endpoint merges project-attached outcomes with the outcomes collection, scopes visibility by role, and computes participation, success and failure rates, the rank distribution and the average failure position. The performance endpoint scopes reviews by role and produces member, task, project and category aggregations together with recent review details.</w:t>
       </w:r>
     </w:p>
     <w:p>
@@ -11567,7 +11567,7 @@
           <w:i w:val="0"/>
           <w:sz w:val="24"/>
         </w:rPr>
-        <w:t>The Kanban board implements native drag-and-drop with per-column drop handlers that route through the status endpoint; completing a task from the board opens the review modal so the rating rule cannot be bypassed. The Gantt view computes proportional offsets between the earliest start and latest end. The unified calendar merges project deadlines and task due dates, coloured by category, with role-aware task visibility. The Creator dashboard offers a pipeline editor with selection, deadlines, reordering, and custom stages.</w:t>
+        <w:t>The Kanban board uses native drag-and-drop with per-column drop handlers that route through the status endpoint, and completing a task from the board opens the review modal so the rating rule cannot be skipped. The Gantt view computes proportional offsets between the earliest start and the latest end. The unified calendar merges project deadlines and task due dates, coloured by category, with role-aware visibility of tasks. The Creator dashboard also offers a pipeline editor with selection, deadlines, reordering and custom stages.</w:t>
       </w:r>
     </w:p>
     <w:p>
@@ -11595,7 +11595,7 @@
           <w:i w:val="0"/>
           <w:sz w:val="24"/>
         </w:rPr>
-        <w:t>Table 5.1: Authentication, user and experience endpoints</w:t>
+        <w:t>Table 5.1: Login, user, profile and experience routes</w:t>
       </w:r>
     </w:p>
     <w:tbl>
@@ -12210,7 +12210,7 @@
           <w:i w:val="0"/>
           <w:sz w:val="24"/>
         </w:rPr>
-        <w:t>Table 5.2: Project and category endpoints</w:t>
+        <w:t>Table 5.2: Project and category routes</w:t>
       </w:r>
     </w:p>
     <w:tbl>
@@ -13259,7 +13259,7 @@
           <w:i w:val="0"/>
           <w:sz w:val="24"/>
         </w:rPr>
-        <w:t>Table 5.3: Team and task endpoints</w:t>
+        <w:t>Table 5.3: Team and task routes</w:t>
       </w:r>
     </w:p>
     <w:tbl>
@@ -13998,7 +13998,7 @@
           <w:i w:val="0"/>
           <w:sz w:val="24"/>
         </w:rPr>
-        <w:t>Table 5.4: Notification and analytics endpoints</w:t>
+        <w:t>Table 5.4: Notification and analytics routes</w:t>
       </w:r>
     </w:p>
     <w:tbl>
@@ -14427,7 +14427,7 @@
           <w:i w:val="0"/>
           <w:sz w:val="24"/>
         </w:rPr>
-        <w:t>Table 5.5: Frontend pages and reusable components</w:t>
+        <w:t>Table 5.5: Pages and shared components on the frontend</w:t>
       </w:r>
     </w:p>
     <w:tbl>
@@ -15048,7 +15048,7 @@
           <w:i w:val="0"/>
           <w:sz w:val="24"/>
         </w:rPr>
-        <w:t>The implementation realises every design rule as enforceable code: codes, scopes, caps, gates, ratings, and reconciliation. Chapter 6 examines the results.</w:t>
+        <w:t>Every rule in the design exists as enforceable code: the codes, the scopes, the caps, the gates, the ratings and the reconciliation. Chapter 6 looks at what that code delivers.</w:t>
       </w:r>
     </w:p>
     <w:p>
@@ -15108,7 +15108,7 @@
           <w:i w:val="0"/>
           <w:sz w:val="24"/>
         </w:rPr>
-        <w:t>This chapter presents what the completed system delivers against its objectives, demonstrates three representative end-to-end flows, and discusses observed behaviour and limitations.</w:t>
+        <w:t>This chapter states what the finished system delivers against the objectives, walks through three representative end-to-end flows, and discusses the behaviour I observed along with the limitations.</w:t>
       </w:r>
     </w:p>
     <w:p>
@@ -15138,7 +15138,7 @@
           <w:i w:val="0"/>
           <w:sz w:val="24"/>
         </w:rPr>
-        <w:t>All five dashboards operate over the shared data with role-correct visibility and mutation rights, as summarised in Figure 6.1.</w:t>
+        <w:t>All five dashboards run on the same data with role-correct visibility and mutation rights. Figure 6.1 summarises what each role receives.</w:t>
       </w:r>
     </w:p>
     <w:p>
@@ -15193,7 +15193,7 @@
           <w:i w:val="0"/>
           <w:sz w:val="24"/>
         </w:rPr>
-        <w:t>Figure 6.1: Integrated functional outcomes by role</w:t>
+        <w:t>Figure 6.1: What each role receives from the finished system</w:t>
       </w:r>
     </w:p>
     <w:p>
@@ -15221,7 +15221,7 @@
           <w:i w:val="0"/>
           <w:sz w:val="24"/>
         </w:rPr>
-        <w:t>Table 6.1: Outcome against project objectives</w:t>
+        <w:t>Table 6.1: How the delivered system meets each objective</w:t>
       </w:r>
     </w:p>
     <w:tbl>
@@ -15595,7 +15595,7 @@
           <w:i w:val="0"/>
           <w:sz w:val="24"/>
         </w:rPr>
-        <w:t>The Creator submits the creation form with a selected and ordered stage pipeline. The client pre-checks name duplication, the server re-validates, generates the next LT code, normalises stages, auto-assigns the HOD by category, stores the project as In Progress, and notifies the chosen Senior Lead. The dashboard refreshes and the new tender appears in the HOD's unassigned queue only for the HOD whose category scope matches.</w:t>
+        <w:t>The Creator fills the creation form and picks an ordered stage pipeline. The client pre-checks the name for duplicates, the server re-validates, generates the next LT code, normalises the stages, auto-assigns the HOD by category, stores the project as In Progress and notifies the chosen Senior Lead. When the dashboards refresh, the new tender appears in the unassigned queue of only the HOD whose category scope matches, which was a satisfying rule to see working.</w:t>
       </w:r>
     </w:p>
     <w:p>
@@ -15625,7 +15625,7 @@
           <w:i w:val="0"/>
           <w:sz w:val="24"/>
         </w:rPr>
-        <w:t>Dragging a card between columns issues a status update. Moving a task to Completed opens the review modal; submitting without a valid rating is rejected by the server with an explanatory error, and with a rating the handler records the review, stamps the task, appends the activity entry, and notifies the assigner. The member's feed and the analytics aggregations reflect the change immediately.</w:t>
+        <w:t>Dragging a card between columns issues a status update. Moving a task to Completed opens the review modal, and submitting it without a valid rating is rejected by the server with a clear error. With a rating, the handler records the review, stamps the task, appends the activity entry and notifies the assigner. The member's feed and the analytics aggregations reflect the change immediately.</w:t>
       </w:r>
     </w:p>
     <w:p>
@@ -15655,7 +15655,7 @@
           <w:i w:val="0"/>
           <w:sz w:val="24"/>
         </w:rPr>
-        <w:t>When the final pipeline stage is toggled, the project auto-completes. The synchronisation engine then writes experience rows for the HOD, Senior Lead, Team Lead, and members, leadership rows for the leads with team sizes, mirrors the legacy history, and raises one completion notification per participant. Profiles, the employees directory, and team-formation recommendations show the new records without further action.</w:t>
+        <w:t>When the last pipeline stage is toggled, the project auto-completes. The synchronisation engine then writes experience rows for the HOD, the Senior Lead, the Team Lead and the members, writes leadership rows for the leads with their team sizes, mirrors the legacy history and raises one completion notification per participant. Profiles, the employees directory and the team-formation recommendations show the new records without anyone doing anything extra.</w:t>
       </w:r>
     </w:p>
     <w:p>
@@ -15685,7 +15685,7 @@
           <w:i w:val="0"/>
           <w:sz w:val="24"/>
         </w:rPr>
-        <w:t>The tender dashboard reports participation, success and failure rates, the distribution of failure rankings, and the average failure position, scoped per role. The performance dashboard ranks members by average review rating, surfaces each member's best category, and aggregates task, project, and category quality. Because every figure reads the same backend aggregations, the dashboards remain mutually consistent.</w:t>
+        <w:t>The tender dashboard reports participation, success and failure rates, the distribution of failure rankings and the average failure position, scoped per role. The performance dashboard ranks members by average review rating, shows each member's best category, and aggregates task, project and category quality. Because every figure reads the same backend aggregations, the dashboards never disagree with each other.</w:t>
       </w:r>
     </w:p>
     <w:p>
@@ -15715,7 +15715,7 @@
           <w:i w:val="0"/>
           <w:sz w:val="24"/>
         </w:rPr>
-        <w:t>The in-memory store resets on restart and diverges across load-balanced replicas; seed passwords are plaintext; the documentation's demo account list differs from the seeded users; milestones and the Viewer role are present but unexercised; and notifications rely on polling. These are recorded as technical debt and guide the future work of Chapter 8.</w:t>
+        <w:t>The in-memory store resets on restart and diverges across load-balanced replicas. Seed passwords are plaintext. The documentation's demo account list differs from the seeded users. Milestones and the Viewer role exist but are never exercised, and notifications rely on polling. I have recorded all of these as technical debt, and they set the priorities for the future work in Chapter 8.</w:t>
       </w:r>
     </w:p>
     <w:p>
@@ -15754,7 +15754,7 @@
           <w:i w:val="0"/>
           <w:sz w:val="24"/>
         </w:rPr>
-        <w:t>The system delivers its intended lifecycle, people, and analytics outcomes with explicit, enforceable rules; its limitations are known, bounded, and documented.</w:t>
+        <w:t>The system delivers the intended lifecycle, people and analytics outcomes with rules that are explicit and enforced. Its limitations are known, bounded and written down, which for a two-month prototype is exactly where they should be.</w:t>
       </w:r>
     </w:p>
     <w:p>
@@ -15814,7 +15814,7 @@
           <w:i w:val="0"/>
           <w:sz w:val="24"/>
         </w:rPr>
-        <w:t>Validation combined manual UI walkthroughs for each role with API-level checks of gates and business rules during development. Each endpoint was exercised with authorized, unauthorized, and out-of-role callers; each workflow was executed end to end in the interface; and boundary conditions were probed with invalid payloads. Because the internship environment is a prototype, automated suites were not introduced; their absence is recorded as future work.</w:t>
+        <w:t>Validation combined manual UI walkthroughs for each role with API-level checks of the gates and business rules, done continuously during development. Each endpoint was tried with authorised, unauthorised and out-of-role callers, each workflow was run end to end in the interface, and boundary conditions were probed with invalid payloads. Because the internship environment is a prototype, no automated suite was introduced; that absence is recorded as future work rather than hidden.</w:t>
       </w:r>
     </w:p>
     <w:p>
@@ -15842,7 +15842,7 @@
           <w:i w:val="0"/>
           <w:sz w:val="24"/>
         </w:rPr>
-        <w:t>Table 7.1: Authentication and RBAC validation cases</w:t>
+        <w:t>Table 7.1: Security and role-rule checks performed</w:t>
       </w:r>
     </w:p>
     <w:tbl>
@@ -16471,7 +16471,7 @@
           <w:i w:val="0"/>
           <w:sz w:val="24"/>
         </w:rPr>
-        <w:t>Table 7.2: Workflow and boundary validation cases</w:t>
+        <w:t>Table 7.2: Workflow and boundary checks performed</w:t>
       </w:r>
     </w:p>
     <w:tbl>
@@ -17224,7 +17224,7 @@
           <w:i w:val="0"/>
           <w:sz w:val="24"/>
         </w:rPr>
-        <w:t>Table 7.3: Known prototype limitations</w:t>
+        <w:t>Table 7.3: Prototype limitations noted during validation</w:t>
       </w:r>
     </w:p>
     <w:tbl>
@@ -17669,7 +17669,7 @@
           <w:i w:val="0"/>
           <w:sz w:val="24"/>
         </w:rPr>
-        <w:t>The validation covers authentication, RBAC, lifecycle rules, and the principal workflows, but component tests, browser automation, load testing, and accessibility audits remain absent. The load-balanced topology was exercised for routing and health behaviour, not for sustained concurrency.</w:t>
+        <w:t>The validation covers authentication, RBAC, the lifecycle rules and the principal workflows. Component tests, browser automation, load testing and accessibility audits are absent, and the load-balanced topology was exercised for routing and health behaviour rather than sustained concurrency. I list this openly so that the evidence is not read as more than it is.</w:t>
       </w:r>
     </w:p>
     <w:p>
@@ -17708,7 +17708,7 @@
           <w:i w:val="0"/>
           <w:sz w:val="24"/>
         </w:rPr>
-        <w:t>Testing confirmed that the principal pages, endpoints, business rules, and cross-role workflows behave as designed. The recorded limitations are infrastructure and hardening items rather than functional defects, and they define the first priorities of future work.</w:t>
+        <w:t>Testing confirmed that the principal pages, endpoints, business rules and cross-role workflows behave as designed. The recorded limitations are infrastructure and hardening items rather than functional defects, and they define the first priorities of future work.</w:t>
       </w:r>
     </w:p>
     <w:p>
@@ -17768,7 +17768,7 @@
           <w:i w:val="0"/>
           <w:sz w:val="24"/>
         </w:rPr>
-        <w:t>The internship produced a complete, role-based tender lifecycle platform for an infrastructure organization. Its main achievement is the connection between tender intake, leadership assignment, team formation with workload control, a stage-gated bid pipeline, reviewed task execution, completion, and outcome analytics - with every transition reconciled into reusable experience and leadership records.</w:t>
+        <w:t>By the end of the two months I had built a complete, role-based tender lifecycle platform for an infrastructure organisation. Its main achievement is the connection it draws between tender intake, leadership assignment, team formation with workload control, a stage-gated bid pipeline, reviewed task execution, completion and outcome analytics, with every transition reconciled into reusable experience and leadership records.</w:t>
       </w:r>
     </w:p>
     <w:p>
@@ -17798,7 +17798,7 @@
           <w:i w:val="0"/>
           <w:sz w:val="24"/>
         </w:rPr>
-        <w:t>The project met its core objectives: five role dashboards and a Viewer mode, the full lifecycle with automatic coding and HOD scoping, the five-project workload cap, the mandatory task review rule, the experience synchronisation engine, the Kanban/Gantt/calendar visualisations, the analytics dashboards, and the containerised, load-balanced delivery. Prototype boundaries - in-memory persistence, demonstration credentials, and polling notifications - were kept explicit and are not presented as production controls.</w:t>
+        <w:t>The project met its core objectives: five role dashboards and a Viewer mode, the full lifecycle with automatic coding and HOD scoping, the five-project workload cap, the mandatory task review rule, the experience synchronisation engine, the Kanban, Gantt and calendar visualisations, the analytics dashboards, and a containerised, load-balanced delivery. The prototype boundaries, in-memory persistence, demonstration credentials and polling notifications, were kept explicit throughout and are not presented as production controls.</w:t>
       </w:r>
     </w:p>
     <w:p>
@@ -17828,7 +17828,7 @@
           <w:i w:val="0"/>
           <w:sz w:val="24"/>
         </w:rPr>
-        <w:t>The AI Full Stack Intern role strengthened my ability to convert organisational rules into enforceable server-side logic, to design role-focused interfaces that stay coherent across a large surface, and to trace data end to end from a drag on a board to a reconciled record and back into a chart. Working from the office at L&amp;T made the domain concrete: every rule in the system came from a conversation about how tenders actually move.</w:t>
+        <w:t>The AI Full Stack Intern role taught me to convert organisational rules into enforceable server-side logic, to design role-focused interfaces that stay coherent over a large surface, and to trace data end to end from a drag on a board to a reconciled record and back into a chart. Working from office at L&amp;T made the domain concrete for me: almost every rule in the system came from a conversation about how tenders actually move.</w:t>
       </w:r>
     </w:p>
     <w:p>
@@ -17842,7 +17842,7 @@
           <w:i w:val="0"/>
           <w:sz w:val="24"/>
         </w:rPr>
-        <w:t>Table 8.1: Final project outcomes</w:t>
+        <w:t>Table 8.1: Summary of delivered outcomes</w:t>
       </w:r>
     </w:p>
     <w:tbl>
@@ -18202,7 +18202,7 @@
           <w:i w:val="0"/>
           <w:sz w:val="24"/>
         </w:rPr>
-        <w:t>Future work should preserve the connected workflow while replacing prototype shortcuts with production controls. Figure 8.1 and Table 8.2 prioritise the roadmap.</w:t>
+        <w:t>Future work should keep the connected workflow as it is while replacing the prototype shortcuts with production controls. Figure 8.1 and Table 8.2 prioritise the roadmap.</w:t>
       </w:r>
     </w:p>
     <w:p>
@@ -18232,7 +18232,7 @@
           <w:i w:val="0"/>
           <w:sz w:val="24"/>
         </w:rPr>
-        <w:t>The principal next step is to replace the in-memory store with a SQL Server database administered through SSMS, using the mssql driver for Node.js, with the existing collections mapping directly onto relational tables and the counters onto identities [16], [17]. This also unifies state across load-balanced replicas.</w:t>
+        <w:t>The most important next step is to replace the in-memory store with a SQL Server database administered through SSMS, using the mssql driver for Node.js. The existing collections map directly onto relational tables and the counters onto identities [16], [17], and the change would also unify state across the load-balanced replicas.</w:t>
       </w:r>
     </w:p>
     <w:p>
@@ -18262,7 +18262,7 @@
           <w:i w:val="0"/>
           <w:sz w:val="24"/>
         </w:rPr>
-        <w:t>Hash stored credentials, move the JWT secret to environment-managed configuration, tighten CORS to the deployed origin, and add server-side rate limits and audit logging.</w:t>
+        <w:t>Stored credentials should be hashed, the JWT secret should move to environment-managed configuration, CORS should be tightened to the deployed origin, and server-side rate limits and audit logging should be added.</w:t>
       </w:r>
     </w:p>
     <w:p>
@@ -18292,7 +18292,7 @@
           <w:i w:val="0"/>
           <w:sz w:val="24"/>
         </w:rPr>
-        <w:t>Replace polling with push-based notifications, activate the milestones collection as first-class calendar events, and generalise HOD scoping from name matching to a stored category-scope table.</w:t>
+        <w:t>Polling should be replaced with push-based notifications, the milestones collection should become first-class calendar events, and HOD scoping should generalise from name matching to a stored category-scope table.</w:t>
       </w:r>
     </w:p>
     <w:p>
@@ -18322,7 +18322,7 @@
           <w:i w:val="0"/>
           <w:sz w:val="24"/>
         </w:rPr>
-        <w:t>Introduce API integration tests, browser automation for the principal workflows, accessibility review of dense dashboards, and retirement or wiring of legacy components.</w:t>
+        <w:t>The remaining items are API integration tests, browser automation for the principal workflows, an accessibility review of the dense dashboards, and either wiring or retiring the legacy components.</w:t>
       </w:r>
     </w:p>
     <w:p>
@@ -18377,7 +18377,7 @@
           <w:i w:val="0"/>
           <w:sz w:val="24"/>
         </w:rPr>
-        <w:t>Figure 8.1: Proposed future development roadmap</w:t>
+        <w:t>Figure 8.1: Planned upgrades after the internship</w:t>
       </w:r>
     </w:p>
     <w:p>
@@ -18391,7 +18391,7 @@
           <w:i w:val="0"/>
           <w:sz w:val="24"/>
         </w:rPr>
-        <w:t>Table 8.2: Prioritized future-development roadmap</w:t>
+        <w:t>Table 8.2: Roadmap for taking the prototype to production</w:t>
       </w:r>
     </w:p>
     <w:tbl>
@@ -19085,7 +19085,7 @@
           <w:i/>
           <w:sz w:val="24"/>
         </w:rPr>
-        <w:t>Reserved for the signed or system-generated monthly attendance report covering the internship period from 1 June 2026 to 31 July 2026 at Larsen &amp; Toubro. The final evidence may be inserted as an image or scanned document without changing the chapter sequence.</w:t>
+        <w:t>This section is reserved for the monthly attendance record of the internship, covering 1 June 2026 to 31 July 2026 at Larsen &amp; Toubro. The signed or system-generated report can be inserted here as a scan before final submission, and the chapter order stays as it is.</w:t>
       </w:r>
     </w:p>
     <w:p/>
@@ -19156,7 +19156,7 @@
           <w:i/>
           <w:sz w:val="24"/>
         </w:rPr>
-        <w:t>Reserved for the completed supervisor feedback form bearing the appropriate signature and organization stamp. The final scanned form may be inserted in this area before submission.</w:t>
+        <w:t>This section is reserved for the supervisor's feedback form with the required signature and organization stamp. The completed form can be scanned and inserted in this space before submission.</w:t>
       </w:r>
     </w:p>
     <w:p/>

</xml_diff>